<commit_message>
docs: expand query plan evidence
</commit_message>
<xml_diff>
--- a/postgresql/documentacion/Etapa_3_Samuel_Parra.docx
+++ b/postgresql/documentacion/Etapa_3_Samuel_Parra.docx
@@ -88,13 +88,7 @@
         <w:rPr>
           <w:lang w:val="es-CO"/>
         </w:rPr>
-        <w:t xml:space="preserve">La consulta identifica las brechas detectadas durante el último año, con severidad Alta o </w:t>
-      </w:r>
-      <w:r>
-        <w:rPr>
-          <w:lang w:val="es-CO"/>
-        </w:rPr>
-        <w:t>Crítica, que hayan expuesto al menos un tipo de dato de sensibilidad Crítica. Para cada brecha se cuenta el total de usuarios distintos afectados, sin limitar el conteo únicamente a los datos críticos.</w:t>
+        <w:t>La consulta identifica las brechas detectadas durante el último año, con severidad Alta o Crítica, que hayan expuesto al menos un tipo de dato de sensibilidad Crítica. Para cada brecha se cuenta el total de usuarios distintos afectados, sin limitar el conteo únicamente a los datos críticos.</w:t>
       </w:r>
     </w:p>
     <w:p>
@@ -120,7 +114,6 @@
           <w:lang w:val="es-CO"/>
         </w:rPr>
       </w:pPr>
-      <w:proofErr w:type="spellStart"/>
       <w:r>
         <w:rPr>
           <w:rFonts w:ascii="Consolas" w:hAnsi="Consolas"/>
@@ -129,7 +122,6 @@
         </w:rPr>
         <w:t>select</w:t>
       </w:r>
-      <w:proofErr w:type="spellEnd"/>
       <w:r>
         <w:rPr>
           <w:lang w:val="es-CO"/>
@@ -142,25 +134,35 @@
           <w:sz w:val="16"/>
           <w:lang w:val="es-CO"/>
         </w:rPr>
-        <w:t xml:space="preserve">    </w:t>
+        <w:t xml:space="preserve">    o.nombre_organizacion,</w:t>
       </w:r>
-      <w:proofErr w:type="spellStart"/>
+      <w:r>
+        <w:rPr>
+          <w:lang w:val="es-CO"/>
+        </w:rPr>
+        <w:br/>
+      </w:r>
       <w:r>
         <w:rPr>
           <w:rFonts w:ascii="Consolas" w:hAnsi="Consolas"/>
           <w:sz w:val="16"/>
           <w:lang w:val="es-CO"/>
         </w:rPr>
-        <w:t>o.nombre_organizacion</w:t>
+        <w:t xml:space="preserve">    b.codigo_brecha,</w:t>
       </w:r>
-      <w:proofErr w:type="spellEnd"/>
+      <w:r>
+        <w:rPr>
+          <w:lang w:val="es-CO"/>
+        </w:rPr>
+        <w:br/>
+      </w:r>
       <w:r>
         <w:rPr>
           <w:rFonts w:ascii="Consolas" w:hAnsi="Consolas"/>
           <w:sz w:val="16"/>
           <w:lang w:val="es-CO"/>
         </w:rPr>
-        <w:t>,</w:t>
+        <w:t xml:space="preserve">    b.fecha_deteccion,</w:t>
       </w:r>
       <w:r>
         <w:rPr>
@@ -174,25 +176,35 @@
           <w:sz w:val="16"/>
           <w:lang w:val="es-CO"/>
         </w:rPr>
-        <w:t xml:space="preserve">    </w:t>
+        <w:t xml:space="preserve">    b.vector_ataque,</w:t>
       </w:r>
-      <w:proofErr w:type="spellStart"/>
+      <w:r>
+        <w:rPr>
+          <w:lang w:val="es-CO"/>
+        </w:rPr>
+        <w:br/>
+      </w:r>
       <w:r>
         <w:rPr>
           <w:rFonts w:ascii="Consolas" w:hAnsi="Consolas"/>
           <w:sz w:val="16"/>
           <w:lang w:val="es-CO"/>
         </w:rPr>
-        <w:t>b.codigo_brecha</w:t>
+        <w:t xml:space="preserve">    count(distinct e.codigo_usuario) as usuarios_afectados</w:t>
       </w:r>
-      <w:proofErr w:type="spellEnd"/>
+      <w:r>
+        <w:rPr>
+          <w:lang w:val="es-CO"/>
+        </w:rPr>
+        <w:br/>
+      </w:r>
       <w:r>
         <w:rPr>
           <w:rFonts w:ascii="Consolas" w:hAnsi="Consolas"/>
           <w:sz w:val="16"/>
           <w:lang w:val="es-CO"/>
         </w:rPr>
-        <w:t>,</w:t>
+        <w:t>from brechas_seguridad.brecha b</w:t>
       </w:r>
       <w:r>
         <w:rPr>
@@ -206,25 +218,35 @@
           <w:sz w:val="16"/>
           <w:lang w:val="es-CO"/>
         </w:rPr>
-        <w:t xml:space="preserve">    </w:t>
+        <w:t>join brechas_seguridad.organizacion o</w:t>
       </w:r>
-      <w:proofErr w:type="spellStart"/>
+      <w:r>
+        <w:rPr>
+          <w:lang w:val="es-CO"/>
+        </w:rPr>
+        <w:br/>
+      </w:r>
       <w:r>
         <w:rPr>
           <w:rFonts w:ascii="Consolas" w:hAnsi="Consolas"/>
           <w:sz w:val="16"/>
           <w:lang w:val="es-CO"/>
         </w:rPr>
-        <w:t>b.fecha_deteccion</w:t>
+        <w:t xml:space="preserve">    on o.id_organizacion = b.id_organizacion</w:t>
       </w:r>
-      <w:proofErr w:type="spellEnd"/>
+      <w:r>
+        <w:rPr>
+          <w:lang w:val="es-CO"/>
+        </w:rPr>
+        <w:br/>
+      </w:r>
       <w:r>
         <w:rPr>
           <w:rFonts w:ascii="Consolas" w:hAnsi="Consolas"/>
           <w:sz w:val="16"/>
           <w:lang w:val="es-CO"/>
         </w:rPr>
-        <w:t>,</w:t>
+        <w:t>join brechas_seguridad.exposicion_usuario_brecha e</w:t>
       </w:r>
       <w:r>
         <w:rPr>
@@ -238,25 +260,35 @@
           <w:sz w:val="16"/>
           <w:lang w:val="es-CO"/>
         </w:rPr>
-        <w:t xml:space="preserve">    </w:t>
+        <w:t xml:space="preserve">    on e.codigo_brecha = b.codigo_brecha</w:t>
       </w:r>
-      <w:proofErr w:type="spellStart"/>
+      <w:r>
+        <w:rPr>
+          <w:lang w:val="es-CO"/>
+        </w:rPr>
+        <w:br/>
+      </w:r>
       <w:r>
         <w:rPr>
           <w:rFonts w:ascii="Consolas" w:hAnsi="Consolas"/>
           <w:sz w:val="16"/>
           <w:lang w:val="es-CO"/>
         </w:rPr>
-        <w:t>b.vector_ataque</w:t>
+        <w:t>where b.fecha_deteccion &gt;= (</w:t>
       </w:r>
-      <w:proofErr w:type="spellEnd"/>
+      <w:r>
+        <w:rPr>
+          <w:lang w:val="es-CO"/>
+        </w:rPr>
+        <w:br/>
+      </w:r>
       <w:r>
         <w:rPr>
           <w:rFonts w:ascii="Consolas" w:hAnsi="Consolas"/>
           <w:sz w:val="16"/>
           <w:lang w:val="es-CO"/>
         </w:rPr>
-        <w:t>,</w:t>
+        <w:t xml:space="preserve">    select max(fecha_deteccion) - interval '1 year'</w:t>
       </w:r>
       <w:r>
         <w:rPr>
@@ -270,113 +302,161 @@
           <w:sz w:val="16"/>
           <w:lang w:val="es-CO"/>
         </w:rPr>
-        <w:t xml:space="preserve">    </w:t>
+        <w:t xml:space="preserve">    from brechas_seguridad.brecha</w:t>
       </w:r>
-      <w:proofErr w:type="spellStart"/>
+      <w:r>
+        <w:rPr>
+          <w:lang w:val="es-CO"/>
+        </w:rPr>
+        <w:br/>
+      </w:r>
       <w:r>
         <w:rPr>
           <w:rFonts w:ascii="Consolas" w:hAnsi="Consolas"/>
           <w:sz w:val="16"/>
           <w:lang w:val="es-CO"/>
         </w:rPr>
-        <w:t>count</w:t>
+        <w:t>)</w:t>
       </w:r>
-      <w:proofErr w:type="spellEnd"/>
+      <w:r>
+        <w:rPr>
+          <w:lang w:val="es-CO"/>
+        </w:rPr>
+        <w:br/>
+      </w:r>
       <w:r>
         <w:rPr>
           <w:rFonts w:ascii="Consolas" w:hAnsi="Consolas"/>
           <w:sz w:val="16"/>
           <w:lang w:val="es-CO"/>
         </w:rPr>
-        <w:t>(</w:t>
+        <w:t>and b.severidad_incidente in ('Alta', 'Critica')</w:t>
       </w:r>
-      <w:proofErr w:type="spellStart"/>
+      <w:r>
+        <w:rPr>
+          <w:lang w:val="es-CO"/>
+        </w:rPr>
+        <w:br/>
+      </w:r>
       <w:r>
         <w:rPr>
           <w:rFonts w:ascii="Consolas" w:hAnsi="Consolas"/>
           <w:sz w:val="16"/>
           <w:lang w:val="es-CO"/>
         </w:rPr>
-        <w:t>distinct</w:t>
+        <w:t>and exists (</w:t>
       </w:r>
-      <w:proofErr w:type="spellEnd"/>
+      <w:r>
+        <w:rPr>
+          <w:lang w:val="es-CO"/>
+        </w:rPr>
+        <w:br/>
+      </w:r>
       <w:r>
         <w:rPr>
           <w:rFonts w:ascii="Consolas" w:hAnsi="Consolas"/>
           <w:sz w:val="16"/>
           <w:lang w:val="es-CO"/>
         </w:rPr>
-        <w:t xml:space="preserve"> </w:t>
+        <w:t xml:space="preserve">    select 1</w:t>
       </w:r>
-      <w:proofErr w:type="spellStart"/>
+      <w:r>
+        <w:rPr>
+          <w:lang w:val="es-CO"/>
+        </w:rPr>
+        <w:br/>
+      </w:r>
       <w:r>
         <w:rPr>
           <w:rFonts w:ascii="Consolas" w:hAnsi="Consolas"/>
           <w:sz w:val="16"/>
           <w:lang w:val="es-CO"/>
         </w:rPr>
-        <w:t>e.codigo_usuario</w:t>
+        <w:t xml:space="preserve">    from brechas_seguridad.exposicion_usuario_brecha e_critica</w:t>
       </w:r>
-      <w:proofErr w:type="spellEnd"/>
+      <w:r>
+        <w:rPr>
+          <w:lang w:val="es-CO"/>
+        </w:rPr>
+        <w:br/>
+      </w:r>
       <w:r>
         <w:rPr>
           <w:rFonts w:ascii="Consolas" w:hAnsi="Consolas"/>
           <w:sz w:val="16"/>
           <w:lang w:val="es-CO"/>
         </w:rPr>
-        <w:t xml:space="preserve">) as </w:t>
+        <w:t xml:space="preserve">    join brechas_seguridad.tipo_dato_expuesto t_critico</w:t>
       </w:r>
-      <w:proofErr w:type="spellStart"/>
+      <w:r>
+        <w:rPr>
+          <w:lang w:val="es-CO"/>
+        </w:rPr>
+        <w:br/>
+      </w:r>
       <w:r>
         <w:rPr>
           <w:rFonts w:ascii="Consolas" w:hAnsi="Consolas"/>
           <w:sz w:val="16"/>
           <w:lang w:val="es-CO"/>
         </w:rPr>
-        <w:t>usuarios_afectados</w:t>
+        <w:t xml:space="preserve">        on t_critico.id_tipo_dato = e_critica.id_tipo_dato</w:t>
       </w:r>
-      <w:proofErr w:type="spellEnd"/>
       <w:r>
         <w:rPr>
           <w:lang w:val="es-CO"/>
         </w:rPr>
         <w:br/>
       </w:r>
-      <w:proofErr w:type="spellStart"/>
       <w:r>
         <w:rPr>
           <w:rFonts w:ascii="Consolas" w:hAnsi="Consolas"/>
           <w:sz w:val="16"/>
           <w:lang w:val="es-CO"/>
         </w:rPr>
-        <w:t>from</w:t>
+        <w:t xml:space="preserve">    where e_critica.codigo_brecha = b.codigo_brecha</w:t>
       </w:r>
-      <w:proofErr w:type="spellEnd"/>
+      <w:r>
+        <w:rPr>
+          <w:lang w:val="es-CO"/>
+        </w:rPr>
+        <w:br/>
+      </w:r>
       <w:r>
         <w:rPr>
           <w:rFonts w:ascii="Consolas" w:hAnsi="Consolas"/>
           <w:sz w:val="16"/>
           <w:lang w:val="es-CO"/>
         </w:rPr>
-        <w:t xml:space="preserve"> </w:t>
+        <w:t xml:space="preserve">      and t_critico.categoria_sensibilidad = 'Critica'</w:t>
       </w:r>
-      <w:proofErr w:type="spellStart"/>
+      <w:r>
+        <w:rPr>
+          <w:lang w:val="es-CO"/>
+        </w:rPr>
+        <w:br/>
+      </w:r>
       <w:r>
         <w:rPr>
           <w:rFonts w:ascii="Consolas" w:hAnsi="Consolas"/>
           <w:sz w:val="16"/>
           <w:lang w:val="es-CO"/>
         </w:rPr>
-        <w:t>brechas_seguridad.brecha</w:t>
+        <w:t>)</w:t>
       </w:r>
-      <w:proofErr w:type="spellEnd"/>
+      <w:r>
+        <w:rPr>
+          <w:lang w:val="es-CO"/>
+        </w:rPr>
+        <w:br/>
+      </w:r>
       <w:r>
         <w:rPr>
           <w:rFonts w:ascii="Consolas" w:hAnsi="Consolas"/>
           <w:sz w:val="16"/>
           <w:lang w:val="es-CO"/>
         </w:rPr>
-        <w:t xml:space="preserve"> b</w:t>
+        <w:t>group by</w:t>
       </w:r>
       <w:r>
         <w:rPr>
@@ -384,1045 +464,69 @@
         </w:rPr>
         <w:br/>
       </w:r>
-      <w:proofErr w:type="spellStart"/>
       <w:r>
         <w:rPr>
           <w:rFonts w:ascii="Consolas" w:hAnsi="Consolas"/>
           <w:sz w:val="16"/>
           <w:lang w:val="es-CO"/>
         </w:rPr>
-        <w:t>join</w:t>
+        <w:t xml:space="preserve">    o.nombre_organizacion,</w:t>
       </w:r>
-      <w:proofErr w:type="spellEnd"/>
+      <w:r>
+        <w:rPr>
+          <w:lang w:val="es-CO"/>
+        </w:rPr>
+        <w:br/>
+      </w:r>
       <w:r>
         <w:rPr>
           <w:rFonts w:ascii="Consolas" w:hAnsi="Consolas"/>
           <w:sz w:val="16"/>
           <w:lang w:val="es-CO"/>
         </w:rPr>
-        <w:t xml:space="preserve"> </w:t>
+        <w:t xml:space="preserve">    b.codigo_brecha,</w:t>
       </w:r>
-      <w:proofErr w:type="spellStart"/>
+      <w:r>
+        <w:rPr>
+          <w:lang w:val="es-CO"/>
+        </w:rPr>
+        <w:br/>
+      </w:r>
       <w:r>
         <w:rPr>
           <w:rFonts w:ascii="Consolas" w:hAnsi="Consolas"/>
           <w:sz w:val="16"/>
           <w:lang w:val="es-CO"/>
         </w:rPr>
-        <w:t>brechas_seguridad.organizacion</w:t>
+        <w:t xml:space="preserve">    b.fecha_deteccion,</w:t>
       </w:r>
-      <w:proofErr w:type="spellEnd"/>
+      <w:r>
+        <w:rPr>
+          <w:lang w:val="es-CO"/>
+        </w:rPr>
+        <w:br/>
+      </w:r>
       <w:r>
         <w:rPr>
           <w:rFonts w:ascii="Consolas" w:hAnsi="Consolas"/>
           <w:sz w:val="16"/>
           <w:lang w:val="es-CO"/>
         </w:rPr>
-        <w:t xml:space="preserve"> </w:t>
+        <w:t xml:space="preserve">    b.vector_ataque</w:t>
       </w:r>
-      <w:proofErr w:type="spellStart"/>
+      <w:r>
+        <w:rPr>
+          <w:lang w:val="es-CO"/>
+        </w:rPr>
+        <w:br/>
+      </w:r>
       <w:r>
         <w:rPr>
           <w:rFonts w:ascii="Consolas" w:hAnsi="Consolas"/>
           <w:sz w:val="16"/>
           <w:lang w:val="es-CO"/>
         </w:rPr>
-        <w:t>o</w:t>
-      </w:r>
-      <w:proofErr w:type="spellEnd"/>
-      <w:r>
-        <w:rPr>
-          <w:lang w:val="es-CO"/>
-        </w:rPr>
-        <w:br/>
-      </w:r>
-      <w:r>
-        <w:rPr>
-          <w:rFonts w:ascii="Consolas" w:hAnsi="Consolas"/>
-          <w:sz w:val="16"/>
-          <w:lang w:val="es-CO"/>
-        </w:rPr>
-        <w:t xml:space="preserve">    </w:t>
-      </w:r>
-      <w:proofErr w:type="spellStart"/>
-      <w:r>
-        <w:rPr>
-          <w:rFonts w:ascii="Consolas" w:hAnsi="Consolas"/>
-          <w:sz w:val="16"/>
-          <w:lang w:val="es-CO"/>
-        </w:rPr>
-        <w:t>on</w:t>
-      </w:r>
-      <w:proofErr w:type="spellEnd"/>
-      <w:r>
-        <w:rPr>
-          <w:rFonts w:ascii="Consolas" w:hAnsi="Consolas"/>
-          <w:sz w:val="16"/>
-          <w:lang w:val="es-CO"/>
-        </w:rPr>
-        <w:t xml:space="preserve"> </w:t>
-      </w:r>
-      <w:proofErr w:type="spellStart"/>
-      <w:r>
-        <w:rPr>
-          <w:rFonts w:ascii="Consolas" w:hAnsi="Consolas"/>
-          <w:sz w:val="16"/>
-          <w:lang w:val="es-CO"/>
-        </w:rPr>
-        <w:t>o.id_organizacion</w:t>
-      </w:r>
-      <w:proofErr w:type="spellEnd"/>
-      <w:r>
-        <w:rPr>
-          <w:rFonts w:ascii="Consolas" w:hAnsi="Consolas"/>
-          <w:sz w:val="16"/>
-          <w:lang w:val="es-CO"/>
-        </w:rPr>
-        <w:t xml:space="preserve"> = </w:t>
-      </w:r>
-      <w:proofErr w:type="spellStart"/>
-      <w:r>
-        <w:rPr>
-          <w:rFonts w:ascii="Consolas" w:hAnsi="Consolas"/>
-          <w:sz w:val="16"/>
-          <w:lang w:val="es-CO"/>
-        </w:rPr>
-        <w:t>b.id_organizacion</w:t>
-      </w:r>
-      <w:proofErr w:type="spellEnd"/>
-      <w:r>
-        <w:rPr>
-          <w:lang w:val="es-CO"/>
-        </w:rPr>
-        <w:br/>
-      </w:r>
-      <w:proofErr w:type="spellStart"/>
-      <w:r>
-        <w:rPr>
-          <w:rFonts w:ascii="Consolas" w:hAnsi="Consolas"/>
-          <w:sz w:val="16"/>
-          <w:lang w:val="es-CO"/>
-        </w:rPr>
-        <w:t>join</w:t>
-      </w:r>
-      <w:proofErr w:type="spellEnd"/>
-      <w:r>
-        <w:rPr>
-          <w:rFonts w:ascii="Consolas" w:hAnsi="Consolas"/>
-          <w:sz w:val="16"/>
-          <w:lang w:val="es-CO"/>
-        </w:rPr>
-        <w:t xml:space="preserve"> </w:t>
-      </w:r>
-      <w:proofErr w:type="spellStart"/>
-      <w:r>
-        <w:rPr>
-          <w:rFonts w:ascii="Consolas" w:hAnsi="Consolas"/>
-          <w:sz w:val="16"/>
-          <w:lang w:val="es-CO"/>
-        </w:rPr>
-        <w:t>brechas_se</w:t>
-      </w:r>
-      <w:r>
-        <w:rPr>
-          <w:rFonts w:ascii="Consolas" w:hAnsi="Consolas"/>
-          <w:sz w:val="16"/>
-          <w:lang w:val="es-CO"/>
-        </w:rPr>
-        <w:t>guridad.exposicion_usuario_brecha</w:t>
-      </w:r>
-      <w:proofErr w:type="spellEnd"/>
-      <w:r>
-        <w:rPr>
-          <w:rFonts w:ascii="Consolas" w:hAnsi="Consolas"/>
-          <w:sz w:val="16"/>
-          <w:lang w:val="es-CO"/>
-        </w:rPr>
-        <w:t xml:space="preserve"> e</w:t>
-      </w:r>
-      <w:r>
-        <w:rPr>
-          <w:lang w:val="es-CO"/>
-        </w:rPr>
-        <w:br/>
-      </w:r>
-      <w:r>
-        <w:rPr>
-          <w:rFonts w:ascii="Consolas" w:hAnsi="Consolas"/>
-          <w:sz w:val="16"/>
-          <w:lang w:val="es-CO"/>
-        </w:rPr>
-        <w:t xml:space="preserve">    </w:t>
-      </w:r>
-      <w:proofErr w:type="spellStart"/>
-      <w:r>
-        <w:rPr>
-          <w:rFonts w:ascii="Consolas" w:hAnsi="Consolas"/>
-          <w:sz w:val="16"/>
-          <w:lang w:val="es-CO"/>
-        </w:rPr>
-        <w:t>on</w:t>
-      </w:r>
-      <w:proofErr w:type="spellEnd"/>
-      <w:r>
-        <w:rPr>
-          <w:rFonts w:ascii="Consolas" w:hAnsi="Consolas"/>
-          <w:sz w:val="16"/>
-          <w:lang w:val="es-CO"/>
-        </w:rPr>
-        <w:t xml:space="preserve"> </w:t>
-      </w:r>
-      <w:proofErr w:type="spellStart"/>
-      <w:r>
-        <w:rPr>
-          <w:rFonts w:ascii="Consolas" w:hAnsi="Consolas"/>
-          <w:sz w:val="16"/>
-          <w:lang w:val="es-CO"/>
-        </w:rPr>
-        <w:t>e.codigo_brecha</w:t>
-      </w:r>
-      <w:proofErr w:type="spellEnd"/>
-      <w:r>
-        <w:rPr>
-          <w:rFonts w:ascii="Consolas" w:hAnsi="Consolas"/>
-          <w:sz w:val="16"/>
-          <w:lang w:val="es-CO"/>
-        </w:rPr>
-        <w:t xml:space="preserve"> = </w:t>
-      </w:r>
-      <w:proofErr w:type="spellStart"/>
-      <w:r>
-        <w:rPr>
-          <w:rFonts w:ascii="Consolas" w:hAnsi="Consolas"/>
-          <w:sz w:val="16"/>
-          <w:lang w:val="es-CO"/>
-        </w:rPr>
-        <w:t>b.codigo_brecha</w:t>
-      </w:r>
-      <w:proofErr w:type="spellEnd"/>
-      <w:r>
-        <w:rPr>
-          <w:lang w:val="es-CO"/>
-        </w:rPr>
-        <w:br/>
-      </w:r>
-      <w:proofErr w:type="spellStart"/>
-      <w:r>
-        <w:rPr>
-          <w:rFonts w:ascii="Consolas" w:hAnsi="Consolas"/>
-          <w:sz w:val="16"/>
-          <w:lang w:val="es-CO"/>
-        </w:rPr>
-        <w:t>where</w:t>
-      </w:r>
-      <w:proofErr w:type="spellEnd"/>
-      <w:r>
-        <w:rPr>
-          <w:rFonts w:ascii="Consolas" w:hAnsi="Consolas"/>
-          <w:sz w:val="16"/>
-          <w:lang w:val="es-CO"/>
-        </w:rPr>
-        <w:t xml:space="preserve"> </w:t>
-      </w:r>
-      <w:proofErr w:type="spellStart"/>
-      <w:r>
-        <w:rPr>
-          <w:rFonts w:ascii="Consolas" w:hAnsi="Consolas"/>
-          <w:sz w:val="16"/>
-          <w:lang w:val="es-CO"/>
-        </w:rPr>
-        <w:t>b.fecha_deteccion</w:t>
-      </w:r>
-      <w:proofErr w:type="spellEnd"/>
-      <w:r>
-        <w:rPr>
-          <w:rFonts w:ascii="Consolas" w:hAnsi="Consolas"/>
-          <w:sz w:val="16"/>
-          <w:lang w:val="es-CO"/>
-        </w:rPr>
-        <w:t xml:space="preserve"> &gt;= (</w:t>
-      </w:r>
-      <w:r>
-        <w:rPr>
-          <w:lang w:val="es-CO"/>
-        </w:rPr>
-        <w:br/>
-      </w:r>
-      <w:r>
-        <w:rPr>
-          <w:rFonts w:ascii="Consolas" w:hAnsi="Consolas"/>
-          <w:sz w:val="16"/>
-          <w:lang w:val="es-CO"/>
-        </w:rPr>
-        <w:t xml:space="preserve">    </w:t>
-      </w:r>
-      <w:proofErr w:type="spellStart"/>
-      <w:r>
-        <w:rPr>
-          <w:rFonts w:ascii="Consolas" w:hAnsi="Consolas"/>
-          <w:sz w:val="16"/>
-          <w:lang w:val="es-CO"/>
-        </w:rPr>
-        <w:t>select</w:t>
-      </w:r>
-      <w:proofErr w:type="spellEnd"/>
-      <w:r>
-        <w:rPr>
-          <w:rFonts w:ascii="Consolas" w:hAnsi="Consolas"/>
-          <w:sz w:val="16"/>
-          <w:lang w:val="es-CO"/>
-        </w:rPr>
-        <w:t xml:space="preserve"> </w:t>
-      </w:r>
-      <w:proofErr w:type="spellStart"/>
-      <w:r>
-        <w:rPr>
-          <w:rFonts w:ascii="Consolas" w:hAnsi="Consolas"/>
-          <w:sz w:val="16"/>
-          <w:lang w:val="es-CO"/>
-        </w:rPr>
-        <w:t>max</w:t>
-      </w:r>
-      <w:proofErr w:type="spellEnd"/>
-      <w:r>
-        <w:rPr>
-          <w:rFonts w:ascii="Consolas" w:hAnsi="Consolas"/>
-          <w:sz w:val="16"/>
-          <w:lang w:val="es-CO"/>
-        </w:rPr>
-        <w:t>(</w:t>
-      </w:r>
-      <w:proofErr w:type="spellStart"/>
-      <w:r>
-        <w:rPr>
-          <w:rFonts w:ascii="Consolas" w:hAnsi="Consolas"/>
-          <w:sz w:val="16"/>
-          <w:lang w:val="es-CO"/>
-        </w:rPr>
-        <w:t>fecha_deteccion</w:t>
-      </w:r>
-      <w:proofErr w:type="spellEnd"/>
-      <w:r>
-        <w:rPr>
-          <w:rFonts w:ascii="Consolas" w:hAnsi="Consolas"/>
-          <w:sz w:val="16"/>
-          <w:lang w:val="es-CO"/>
-        </w:rPr>
-        <w:t xml:space="preserve">) - </w:t>
-      </w:r>
-      <w:proofErr w:type="spellStart"/>
-      <w:r>
-        <w:rPr>
-          <w:rFonts w:ascii="Consolas" w:hAnsi="Consolas"/>
-          <w:sz w:val="16"/>
-          <w:lang w:val="es-CO"/>
-        </w:rPr>
-        <w:t>interval</w:t>
-      </w:r>
-      <w:proofErr w:type="spellEnd"/>
-      <w:r>
-        <w:rPr>
-          <w:rFonts w:ascii="Consolas" w:hAnsi="Consolas"/>
-          <w:sz w:val="16"/>
-          <w:lang w:val="es-CO"/>
-        </w:rPr>
-        <w:t xml:space="preserve"> '1 </w:t>
-      </w:r>
-      <w:proofErr w:type="spellStart"/>
-      <w:r>
-        <w:rPr>
-          <w:rFonts w:ascii="Consolas" w:hAnsi="Consolas"/>
-          <w:sz w:val="16"/>
-          <w:lang w:val="es-CO"/>
-        </w:rPr>
-        <w:t>year</w:t>
-      </w:r>
-      <w:proofErr w:type="spellEnd"/>
-      <w:r>
-        <w:rPr>
-          <w:rFonts w:ascii="Consolas" w:hAnsi="Consolas"/>
-          <w:sz w:val="16"/>
-          <w:lang w:val="es-CO"/>
-        </w:rPr>
-        <w:t>'</w:t>
-      </w:r>
-      <w:r>
-        <w:rPr>
-          <w:lang w:val="es-CO"/>
-        </w:rPr>
-        <w:br/>
-      </w:r>
-      <w:r>
-        <w:rPr>
-          <w:rFonts w:ascii="Consolas" w:hAnsi="Consolas"/>
-          <w:sz w:val="16"/>
-          <w:lang w:val="es-CO"/>
-        </w:rPr>
-        <w:t xml:space="preserve">    </w:t>
-      </w:r>
-      <w:proofErr w:type="spellStart"/>
-      <w:r>
-        <w:rPr>
-          <w:rFonts w:ascii="Consolas" w:hAnsi="Consolas"/>
-          <w:sz w:val="16"/>
-          <w:lang w:val="es-CO"/>
-        </w:rPr>
-        <w:t>from</w:t>
-      </w:r>
-      <w:proofErr w:type="spellEnd"/>
-      <w:r>
-        <w:rPr>
-          <w:rFonts w:ascii="Consolas" w:hAnsi="Consolas"/>
-          <w:sz w:val="16"/>
-          <w:lang w:val="es-CO"/>
-        </w:rPr>
-        <w:t xml:space="preserve"> </w:t>
-      </w:r>
-      <w:proofErr w:type="spellStart"/>
-      <w:r>
-        <w:rPr>
-          <w:rFonts w:ascii="Consolas" w:hAnsi="Consolas"/>
-          <w:sz w:val="16"/>
-          <w:lang w:val="es-CO"/>
-        </w:rPr>
-        <w:t>brechas_seguridad.brecha</w:t>
-      </w:r>
-      <w:proofErr w:type="spellEnd"/>
-      <w:r>
-        <w:rPr>
-          <w:lang w:val="es-CO"/>
-        </w:rPr>
-        <w:br/>
-      </w:r>
-      <w:r>
-        <w:rPr>
-          <w:rFonts w:ascii="Consolas" w:hAnsi="Consolas"/>
-          <w:sz w:val="16"/>
-          <w:lang w:val="es-CO"/>
-        </w:rPr>
-        <w:t>)</w:t>
-      </w:r>
-      <w:r>
-        <w:rPr>
-          <w:lang w:val="es-CO"/>
-        </w:rPr>
-        <w:br/>
-      </w:r>
-      <w:r>
-        <w:rPr>
-          <w:rFonts w:ascii="Consolas" w:hAnsi="Consolas"/>
-          <w:sz w:val="16"/>
-          <w:lang w:val="es-CO"/>
-        </w:rPr>
-        <w:t xml:space="preserve">and </w:t>
-      </w:r>
-      <w:proofErr w:type="spellStart"/>
-      <w:r>
-        <w:rPr>
-          <w:rFonts w:ascii="Consolas" w:hAnsi="Consolas"/>
-          <w:sz w:val="16"/>
-          <w:lang w:val="es-CO"/>
-        </w:rPr>
-        <w:t>b.severidad_incidente</w:t>
-      </w:r>
-      <w:proofErr w:type="spellEnd"/>
-      <w:r>
-        <w:rPr>
-          <w:rFonts w:ascii="Consolas" w:hAnsi="Consolas"/>
-          <w:sz w:val="16"/>
-          <w:lang w:val="es-CO"/>
-        </w:rPr>
-        <w:t xml:space="preserve"> in ('Alta', 'Critica')</w:t>
-      </w:r>
-      <w:r>
-        <w:rPr>
-          <w:lang w:val="es-CO"/>
-        </w:rPr>
-        <w:br/>
-      </w:r>
-      <w:r>
-        <w:rPr>
-          <w:rFonts w:ascii="Consolas" w:hAnsi="Consolas"/>
-          <w:sz w:val="16"/>
-          <w:lang w:val="es-CO"/>
-        </w:rPr>
-        <w:t xml:space="preserve">and </w:t>
-      </w:r>
-      <w:proofErr w:type="spellStart"/>
-      <w:r>
-        <w:rPr>
-          <w:rFonts w:ascii="Consolas" w:hAnsi="Consolas"/>
-          <w:sz w:val="16"/>
-          <w:lang w:val="es-CO"/>
-        </w:rPr>
-        <w:t>exists</w:t>
-      </w:r>
-      <w:proofErr w:type="spellEnd"/>
-      <w:r>
-        <w:rPr>
-          <w:rFonts w:ascii="Consolas" w:hAnsi="Consolas"/>
-          <w:sz w:val="16"/>
-          <w:lang w:val="es-CO"/>
-        </w:rPr>
-        <w:t xml:space="preserve"> (</w:t>
-      </w:r>
-      <w:r>
-        <w:rPr>
-          <w:lang w:val="es-CO"/>
-        </w:rPr>
-        <w:br/>
-      </w:r>
-      <w:r>
-        <w:rPr>
-          <w:rFonts w:ascii="Consolas" w:hAnsi="Consolas"/>
-          <w:sz w:val="16"/>
-          <w:lang w:val="es-CO"/>
-        </w:rPr>
-        <w:t xml:space="preserve">    </w:t>
-      </w:r>
-      <w:proofErr w:type="spellStart"/>
-      <w:r>
-        <w:rPr>
-          <w:rFonts w:ascii="Consolas" w:hAnsi="Consolas"/>
-          <w:sz w:val="16"/>
-          <w:lang w:val="es-CO"/>
-        </w:rPr>
-        <w:t>select</w:t>
-      </w:r>
-      <w:proofErr w:type="spellEnd"/>
-      <w:r>
-        <w:rPr>
-          <w:rFonts w:ascii="Consolas" w:hAnsi="Consolas"/>
-          <w:sz w:val="16"/>
-          <w:lang w:val="es-CO"/>
-        </w:rPr>
-        <w:t xml:space="preserve"> 1</w:t>
-      </w:r>
-      <w:r>
-        <w:rPr>
-          <w:lang w:val="es-CO"/>
-        </w:rPr>
-        <w:br/>
-      </w:r>
-      <w:r>
-        <w:rPr>
-          <w:rFonts w:ascii="Consolas" w:hAnsi="Consolas"/>
-          <w:sz w:val="16"/>
-          <w:lang w:val="es-CO"/>
-        </w:rPr>
-        <w:t xml:space="preserve">    </w:t>
-      </w:r>
-      <w:proofErr w:type="spellStart"/>
-      <w:r>
-        <w:rPr>
-          <w:rFonts w:ascii="Consolas" w:hAnsi="Consolas"/>
-          <w:sz w:val="16"/>
-          <w:lang w:val="es-CO"/>
-        </w:rPr>
-        <w:t>from</w:t>
-      </w:r>
-      <w:proofErr w:type="spellEnd"/>
-      <w:r>
-        <w:rPr>
-          <w:rFonts w:ascii="Consolas" w:hAnsi="Consolas"/>
-          <w:sz w:val="16"/>
-          <w:lang w:val="es-CO"/>
-        </w:rPr>
-        <w:t xml:space="preserve"> </w:t>
-      </w:r>
-      <w:proofErr w:type="spellStart"/>
-      <w:r>
-        <w:rPr>
-          <w:rFonts w:ascii="Consolas" w:hAnsi="Consolas"/>
-          <w:sz w:val="16"/>
-          <w:lang w:val="es-CO"/>
-        </w:rPr>
-        <w:t>brechas_seguridad.exposicion_usuario_brecha</w:t>
-      </w:r>
-      <w:proofErr w:type="spellEnd"/>
-      <w:r>
-        <w:rPr>
-          <w:rFonts w:ascii="Consolas" w:hAnsi="Consolas"/>
-          <w:sz w:val="16"/>
-          <w:lang w:val="es-CO"/>
-        </w:rPr>
-        <w:t xml:space="preserve"> </w:t>
-      </w:r>
-      <w:proofErr w:type="spellStart"/>
-      <w:r>
-        <w:rPr>
-          <w:rFonts w:ascii="Consolas" w:hAnsi="Consolas"/>
-          <w:sz w:val="16"/>
-          <w:lang w:val="es-CO"/>
-        </w:rPr>
-        <w:t>e_critica</w:t>
-      </w:r>
-      <w:proofErr w:type="spellEnd"/>
-      <w:r>
-        <w:rPr>
-          <w:lang w:val="es-CO"/>
-        </w:rPr>
-        <w:br/>
-      </w:r>
-      <w:r>
-        <w:rPr>
-          <w:rFonts w:ascii="Consolas" w:hAnsi="Consolas"/>
-          <w:sz w:val="16"/>
-          <w:lang w:val="es-CO"/>
-        </w:rPr>
-        <w:t xml:space="preserve">    </w:t>
-      </w:r>
-      <w:proofErr w:type="spellStart"/>
-      <w:r>
-        <w:rPr>
-          <w:rFonts w:ascii="Consolas" w:hAnsi="Consolas"/>
-          <w:sz w:val="16"/>
-          <w:lang w:val="es-CO"/>
-        </w:rPr>
-        <w:t>join</w:t>
-      </w:r>
-      <w:proofErr w:type="spellEnd"/>
-      <w:r>
-        <w:rPr>
-          <w:rFonts w:ascii="Consolas" w:hAnsi="Consolas"/>
-          <w:sz w:val="16"/>
-          <w:lang w:val="es-CO"/>
-        </w:rPr>
-        <w:t xml:space="preserve"> </w:t>
-      </w:r>
-      <w:proofErr w:type="spellStart"/>
-      <w:r>
-        <w:rPr>
-          <w:rFonts w:ascii="Consolas" w:hAnsi="Consolas"/>
-          <w:sz w:val="16"/>
-          <w:lang w:val="es-CO"/>
-        </w:rPr>
-        <w:t>brechas_seguridad.tipo_dato_expuesto</w:t>
-      </w:r>
-      <w:proofErr w:type="spellEnd"/>
-      <w:r>
-        <w:rPr>
-          <w:rFonts w:ascii="Consolas" w:hAnsi="Consolas"/>
-          <w:sz w:val="16"/>
-          <w:lang w:val="es-CO"/>
-        </w:rPr>
-        <w:t xml:space="preserve"> </w:t>
-      </w:r>
-      <w:proofErr w:type="spellStart"/>
-      <w:r>
-        <w:rPr>
-          <w:rFonts w:ascii="Consolas" w:hAnsi="Consolas"/>
-          <w:sz w:val="16"/>
-          <w:lang w:val="es-CO"/>
-        </w:rPr>
-        <w:t>t_critico</w:t>
-      </w:r>
-      <w:proofErr w:type="spellEnd"/>
-      <w:r>
-        <w:rPr>
-          <w:lang w:val="es-CO"/>
-        </w:rPr>
-        <w:br/>
-      </w:r>
-      <w:r>
-        <w:rPr>
-          <w:rFonts w:ascii="Consolas" w:hAnsi="Consolas"/>
-          <w:sz w:val="16"/>
-          <w:lang w:val="es-CO"/>
-        </w:rPr>
-        <w:t xml:space="preserve">        </w:t>
-      </w:r>
-      <w:proofErr w:type="spellStart"/>
-      <w:r>
-        <w:rPr>
-          <w:rFonts w:ascii="Consolas" w:hAnsi="Consolas"/>
-          <w:sz w:val="16"/>
-          <w:lang w:val="es-CO"/>
-        </w:rPr>
-        <w:t>on</w:t>
-      </w:r>
-      <w:proofErr w:type="spellEnd"/>
-      <w:r>
-        <w:rPr>
-          <w:rFonts w:ascii="Consolas" w:hAnsi="Consolas"/>
-          <w:sz w:val="16"/>
-          <w:lang w:val="es-CO"/>
-        </w:rPr>
-        <w:t xml:space="preserve"> </w:t>
-      </w:r>
-      <w:proofErr w:type="spellStart"/>
-      <w:r>
-        <w:rPr>
-          <w:rFonts w:ascii="Consolas" w:hAnsi="Consolas"/>
-          <w:sz w:val="16"/>
-          <w:lang w:val="es-CO"/>
-        </w:rPr>
-        <w:t>t_critico.id_tipo_dato</w:t>
-      </w:r>
-      <w:proofErr w:type="spellEnd"/>
-      <w:r>
-        <w:rPr>
-          <w:rFonts w:ascii="Consolas" w:hAnsi="Consolas"/>
-          <w:sz w:val="16"/>
-          <w:lang w:val="es-CO"/>
-        </w:rPr>
-        <w:t xml:space="preserve"> = </w:t>
-      </w:r>
-      <w:proofErr w:type="spellStart"/>
-      <w:r>
-        <w:rPr>
-          <w:rFonts w:ascii="Consolas" w:hAnsi="Consolas"/>
-          <w:sz w:val="16"/>
-          <w:lang w:val="es-CO"/>
-        </w:rPr>
-        <w:t>e_critica.id_tipo_dato</w:t>
-      </w:r>
-      <w:proofErr w:type="spellEnd"/>
-      <w:r>
-        <w:rPr>
-          <w:lang w:val="es-CO"/>
-        </w:rPr>
-        <w:br/>
-      </w:r>
-      <w:r>
-        <w:rPr>
-          <w:rFonts w:ascii="Consolas" w:hAnsi="Consolas"/>
-          <w:sz w:val="16"/>
-          <w:lang w:val="es-CO"/>
-        </w:rPr>
-        <w:t xml:space="preserve">    </w:t>
-      </w:r>
-      <w:proofErr w:type="spellStart"/>
-      <w:r>
-        <w:rPr>
-          <w:rFonts w:ascii="Consolas" w:hAnsi="Consolas"/>
-          <w:sz w:val="16"/>
-          <w:lang w:val="es-CO"/>
-        </w:rPr>
-        <w:t>where</w:t>
-      </w:r>
-      <w:proofErr w:type="spellEnd"/>
-      <w:r>
-        <w:rPr>
-          <w:rFonts w:ascii="Consolas" w:hAnsi="Consolas"/>
-          <w:sz w:val="16"/>
-          <w:lang w:val="es-CO"/>
-        </w:rPr>
-        <w:t xml:space="preserve"> </w:t>
-      </w:r>
-      <w:proofErr w:type="spellStart"/>
-      <w:r>
-        <w:rPr>
-          <w:rFonts w:ascii="Consolas" w:hAnsi="Consolas"/>
-          <w:sz w:val="16"/>
-          <w:lang w:val="es-CO"/>
-        </w:rPr>
-        <w:t>e_critica.codigo_brecha</w:t>
-      </w:r>
-      <w:proofErr w:type="spellEnd"/>
-      <w:r>
-        <w:rPr>
-          <w:rFonts w:ascii="Consolas" w:hAnsi="Consolas"/>
-          <w:sz w:val="16"/>
-          <w:lang w:val="es-CO"/>
-        </w:rPr>
-        <w:t xml:space="preserve"> = </w:t>
-      </w:r>
-      <w:proofErr w:type="spellStart"/>
-      <w:r>
-        <w:rPr>
-          <w:rFonts w:ascii="Consolas" w:hAnsi="Consolas"/>
-          <w:sz w:val="16"/>
-          <w:lang w:val="es-CO"/>
-        </w:rPr>
-        <w:t>b.codigo_brecha</w:t>
-      </w:r>
-      <w:proofErr w:type="spellEnd"/>
-      <w:r>
-        <w:rPr>
-          <w:lang w:val="es-CO"/>
-        </w:rPr>
-        <w:br/>
-      </w:r>
-      <w:r>
-        <w:rPr>
-          <w:rFonts w:ascii="Consolas" w:hAnsi="Consolas"/>
-          <w:sz w:val="16"/>
-          <w:lang w:val="es-CO"/>
-        </w:rPr>
-        <w:t xml:space="preserve">      and </w:t>
-      </w:r>
-      <w:proofErr w:type="spellStart"/>
-      <w:r>
-        <w:rPr>
-          <w:rFonts w:ascii="Consolas" w:hAnsi="Consolas"/>
-          <w:sz w:val="16"/>
-          <w:lang w:val="es-CO"/>
-        </w:rPr>
-        <w:t>t_c</w:t>
-      </w:r>
-      <w:r>
-        <w:rPr>
-          <w:rFonts w:ascii="Consolas" w:hAnsi="Consolas"/>
-          <w:sz w:val="16"/>
-          <w:lang w:val="es-CO"/>
-        </w:rPr>
-        <w:t>ritico.categoria_sensibilidad</w:t>
-      </w:r>
-      <w:proofErr w:type="spellEnd"/>
-      <w:r>
-        <w:rPr>
-          <w:rFonts w:ascii="Consolas" w:hAnsi="Consolas"/>
-          <w:sz w:val="16"/>
-          <w:lang w:val="es-CO"/>
-        </w:rPr>
-        <w:t xml:space="preserve"> = 'Critica'</w:t>
-      </w:r>
-      <w:r>
-        <w:rPr>
-          <w:lang w:val="es-CO"/>
-        </w:rPr>
-        <w:br/>
-      </w:r>
-      <w:r>
-        <w:rPr>
-          <w:rFonts w:ascii="Consolas" w:hAnsi="Consolas"/>
-          <w:sz w:val="16"/>
-          <w:lang w:val="es-CO"/>
-        </w:rPr>
-        <w:t>)</w:t>
-      </w:r>
-      <w:r>
-        <w:rPr>
-          <w:lang w:val="es-CO"/>
-        </w:rPr>
-        <w:br/>
-      </w:r>
-      <w:proofErr w:type="spellStart"/>
-      <w:r>
-        <w:rPr>
-          <w:rFonts w:ascii="Consolas" w:hAnsi="Consolas"/>
-          <w:sz w:val="16"/>
-          <w:lang w:val="es-CO"/>
-        </w:rPr>
-        <w:t>group</w:t>
-      </w:r>
-      <w:proofErr w:type="spellEnd"/>
-      <w:r>
-        <w:rPr>
-          <w:rFonts w:ascii="Consolas" w:hAnsi="Consolas"/>
-          <w:sz w:val="16"/>
-          <w:lang w:val="es-CO"/>
-        </w:rPr>
-        <w:t xml:space="preserve"> </w:t>
-      </w:r>
-      <w:proofErr w:type="spellStart"/>
-      <w:r>
-        <w:rPr>
-          <w:rFonts w:ascii="Consolas" w:hAnsi="Consolas"/>
-          <w:sz w:val="16"/>
-          <w:lang w:val="es-CO"/>
-        </w:rPr>
-        <w:t>by</w:t>
-      </w:r>
-      <w:proofErr w:type="spellEnd"/>
-      <w:r>
-        <w:rPr>
-          <w:lang w:val="es-CO"/>
-        </w:rPr>
-        <w:br/>
-      </w:r>
-      <w:r>
-        <w:rPr>
-          <w:rFonts w:ascii="Consolas" w:hAnsi="Consolas"/>
-          <w:sz w:val="16"/>
-          <w:lang w:val="es-CO"/>
-        </w:rPr>
-        <w:t xml:space="preserve">    </w:t>
-      </w:r>
-      <w:proofErr w:type="spellStart"/>
-      <w:r>
-        <w:rPr>
-          <w:rFonts w:ascii="Consolas" w:hAnsi="Consolas"/>
-          <w:sz w:val="16"/>
-          <w:lang w:val="es-CO"/>
-        </w:rPr>
-        <w:t>o.nombre_organizacion</w:t>
-      </w:r>
-      <w:proofErr w:type="spellEnd"/>
-      <w:r>
-        <w:rPr>
-          <w:rFonts w:ascii="Consolas" w:hAnsi="Consolas"/>
-          <w:sz w:val="16"/>
-          <w:lang w:val="es-CO"/>
-        </w:rPr>
-        <w:t>,</w:t>
-      </w:r>
-      <w:r>
-        <w:rPr>
-          <w:lang w:val="es-CO"/>
-        </w:rPr>
-        <w:br/>
-      </w:r>
-      <w:r>
-        <w:rPr>
-          <w:rFonts w:ascii="Consolas" w:hAnsi="Consolas"/>
-          <w:sz w:val="16"/>
-          <w:lang w:val="es-CO"/>
-        </w:rPr>
-        <w:t xml:space="preserve">    </w:t>
-      </w:r>
-      <w:proofErr w:type="spellStart"/>
-      <w:r>
-        <w:rPr>
-          <w:rFonts w:ascii="Consolas" w:hAnsi="Consolas"/>
-          <w:sz w:val="16"/>
-          <w:lang w:val="es-CO"/>
-        </w:rPr>
-        <w:t>b.codigo_brecha</w:t>
-      </w:r>
-      <w:proofErr w:type="spellEnd"/>
-      <w:r>
-        <w:rPr>
-          <w:rFonts w:ascii="Consolas" w:hAnsi="Consolas"/>
-          <w:sz w:val="16"/>
-          <w:lang w:val="es-CO"/>
-        </w:rPr>
-        <w:t>,</w:t>
-      </w:r>
-      <w:r>
-        <w:rPr>
-          <w:lang w:val="es-CO"/>
-        </w:rPr>
-        <w:br/>
-      </w:r>
-      <w:r>
-        <w:rPr>
-          <w:rFonts w:ascii="Consolas" w:hAnsi="Consolas"/>
-          <w:sz w:val="16"/>
-          <w:lang w:val="es-CO"/>
-        </w:rPr>
-        <w:t xml:space="preserve">    </w:t>
-      </w:r>
-      <w:proofErr w:type="spellStart"/>
-      <w:r>
-        <w:rPr>
-          <w:rFonts w:ascii="Consolas" w:hAnsi="Consolas"/>
-          <w:sz w:val="16"/>
-          <w:lang w:val="es-CO"/>
-        </w:rPr>
-        <w:t>b.fecha_deteccion</w:t>
-      </w:r>
-      <w:proofErr w:type="spellEnd"/>
-      <w:r>
-        <w:rPr>
-          <w:rFonts w:ascii="Consolas" w:hAnsi="Consolas"/>
-          <w:sz w:val="16"/>
-          <w:lang w:val="es-CO"/>
-        </w:rPr>
-        <w:t>,</w:t>
-      </w:r>
-      <w:r>
-        <w:rPr>
-          <w:lang w:val="es-CO"/>
-        </w:rPr>
-        <w:br/>
-      </w:r>
-      <w:r>
-        <w:rPr>
-          <w:rFonts w:ascii="Consolas" w:hAnsi="Consolas"/>
-          <w:sz w:val="16"/>
-          <w:lang w:val="es-CO"/>
-        </w:rPr>
-        <w:t xml:space="preserve">    </w:t>
-      </w:r>
-      <w:proofErr w:type="spellStart"/>
-      <w:r>
-        <w:rPr>
-          <w:rFonts w:ascii="Consolas" w:hAnsi="Consolas"/>
-          <w:sz w:val="16"/>
-          <w:lang w:val="es-CO"/>
-        </w:rPr>
-        <w:t>b.vector_ataque</w:t>
-      </w:r>
-      <w:proofErr w:type="spellEnd"/>
-      <w:r>
-        <w:rPr>
-          <w:lang w:val="es-CO"/>
-        </w:rPr>
-        <w:br/>
-      </w:r>
-      <w:proofErr w:type="spellStart"/>
-      <w:r>
-        <w:rPr>
-          <w:rFonts w:ascii="Consolas" w:hAnsi="Consolas"/>
-          <w:sz w:val="16"/>
-          <w:lang w:val="es-CO"/>
-        </w:rPr>
-        <w:t>order</w:t>
-      </w:r>
-      <w:proofErr w:type="spellEnd"/>
-      <w:r>
-        <w:rPr>
-          <w:rFonts w:ascii="Consolas" w:hAnsi="Consolas"/>
-          <w:sz w:val="16"/>
-          <w:lang w:val="es-CO"/>
-        </w:rPr>
-        <w:t xml:space="preserve"> </w:t>
-      </w:r>
-      <w:proofErr w:type="spellStart"/>
-      <w:r>
-        <w:rPr>
-          <w:rFonts w:ascii="Consolas" w:hAnsi="Consolas"/>
-          <w:sz w:val="16"/>
-          <w:lang w:val="es-CO"/>
-        </w:rPr>
-        <w:t>by</w:t>
-      </w:r>
-      <w:proofErr w:type="spellEnd"/>
-      <w:r>
-        <w:rPr>
-          <w:rFonts w:ascii="Consolas" w:hAnsi="Consolas"/>
-          <w:sz w:val="16"/>
-          <w:lang w:val="es-CO"/>
-        </w:rPr>
-        <w:t xml:space="preserve"> </w:t>
-      </w:r>
-      <w:proofErr w:type="spellStart"/>
-      <w:r>
-        <w:rPr>
-          <w:rFonts w:ascii="Consolas" w:hAnsi="Consolas"/>
-          <w:sz w:val="16"/>
-          <w:lang w:val="es-CO"/>
-        </w:rPr>
-        <w:t>usuarios_afectados</w:t>
-      </w:r>
-      <w:proofErr w:type="spellEnd"/>
-      <w:r>
-        <w:rPr>
-          <w:rFonts w:ascii="Consolas" w:hAnsi="Consolas"/>
-          <w:sz w:val="16"/>
-          <w:lang w:val="es-CO"/>
-        </w:rPr>
-        <w:t xml:space="preserve"> </w:t>
-      </w:r>
-      <w:proofErr w:type="spellStart"/>
-      <w:r>
-        <w:rPr>
-          <w:rFonts w:ascii="Consolas" w:hAnsi="Consolas"/>
-          <w:sz w:val="16"/>
-          <w:lang w:val="es-CO"/>
-        </w:rPr>
-        <w:t>desc</w:t>
-      </w:r>
-      <w:proofErr w:type="spellEnd"/>
-      <w:r>
-        <w:rPr>
-          <w:rFonts w:ascii="Consolas" w:hAnsi="Consolas"/>
-          <w:sz w:val="16"/>
-          <w:lang w:val="es-CO"/>
-        </w:rPr>
-        <w:t>;</w:t>
+        <w:t>order by usuarios_afectados desc;</w:t>
       </w:r>
     </w:p>
     <w:p>
@@ -1451,27 +555,7 @@
         <w:rPr>
           <w:lang w:val="es-CO"/>
         </w:rPr>
-        <w:t>La consulta corregida devuelve 109 brechas y cuenta todos los usuar</w:t>
-      </w:r>
-      <w:r>
-        <w:rPr>
-          <w:lang w:val="es-CO"/>
-        </w:rPr>
-        <w:t xml:space="preserve">ios afectados de cada brecha que cumple la condición crítica. La primera brecha visible es BR-00408 de Reed </w:t>
-      </w:r>
-      <w:proofErr w:type="spellStart"/>
-      <w:r>
-        <w:rPr>
-          <w:lang w:val="es-CO"/>
-        </w:rPr>
-        <w:t>Group</w:t>
-      </w:r>
-      <w:proofErr w:type="spellEnd"/>
-      <w:r>
-        <w:rPr>
-          <w:lang w:val="es-CO"/>
-        </w:rPr>
-        <w:t>, con 58 usuarios afectados.</w:t>
+        <w:t>La consulta corregida devuelve 109 brechas y cuenta todos los usuarios afectados de cada brecha que cumple la condición crítica. La primera brecha visible es BR-00408 de Reed Group, con 58 usuarios afectados.</w:t>
       </w:r>
     </w:p>
     <w:p>
@@ -1529,14 +613,6 @@
           <w:lang w:val="es-CO"/>
         </w:rPr>
       </w:pPr>
-      <w:r>
-        <w:rPr>
-          <w:i/>
-          <w:sz w:val="17"/>
-          <w:lang w:val="es-CO"/>
-        </w:rPr>
-        <w:t>Figura 1. Resultados de la consulta corregida con EXISTS.</w:t>
-      </w:r>
     </w:p>
     <w:p>
       <w:pPr>
@@ -1564,57 +640,26 @@
         <w:rPr>
           <w:lang w:val="es-CO"/>
         </w:rPr>
-        <w:t xml:space="preserve">Sin índices </w:t>
-      </w:r>
-      <w:r>
-        <w:rPr>
-          <w:lang w:val="es-CO"/>
-        </w:rPr>
-        <w:t xml:space="preserve">adicionales, la ejecución registrada tuvo un </w:t>
-      </w:r>
-      <w:proofErr w:type="spellStart"/>
-      <w:r>
-        <w:rPr>
-          <w:lang w:val="es-CO"/>
-        </w:rPr>
-        <w:t>Planning</w:t>
-      </w:r>
-      <w:proofErr w:type="spellEnd"/>
-      <w:r>
-        <w:rPr>
-          <w:lang w:val="es-CO"/>
-        </w:rPr>
-        <w:t xml:space="preserve"> Time de 4.112 ms y un </w:t>
-      </w:r>
-      <w:proofErr w:type="spellStart"/>
-      <w:r>
-        <w:rPr>
-          <w:lang w:val="es-CO"/>
-        </w:rPr>
-        <w:t>Execution</w:t>
-      </w:r>
-      <w:proofErr w:type="spellEnd"/>
-      <w:r>
-        <w:rPr>
-          <w:lang w:val="es-CO"/>
-        </w:rPr>
-        <w:t xml:space="preserve"> Time de 17.767 ms. Esta medición se utiliza como referencia para comparar las mejoras posteriores.</w:t>
+        <w:t>Sin índices adicionales, la ejecución registrada tuvo un Planning Time de 1.106 ms y un Execution Time de 15.543 ms. Esta medición se utiliza como referencia para comparar las mejoras posteriores.</w:t>
       </w:r>
     </w:p>
     <w:p>
       <w:pPr>
         <w:spacing w:after="40"/>
         <w:jc w:val="center"/>
+        <w:rPr>
+          <w:lang w:val="es-CO"/>
+        </w:rPr>
       </w:pPr>
       <w:r>
         <w:rPr>
-          <w:noProof/>
+          <w:lang w:val="es-CO"/>
         </w:rPr>
         <w:drawing>
-          <wp:inline distT="0" distB="0" distL="0" distR="0" wp14:anchorId="57DC4E58" wp14:editId="39B662E1">
-            <wp:extent cx="4389120" cy="387714"/>
-            <wp:effectExtent l="0" t="0" r="0" b="0"/>
-            <wp:docPr id="2" name="Picture 2"/>
+          <wp:inline distT="0" distB="0" distL="0" distR="0" wp14:anchorId="61B0FC9D" wp14:editId="2E625EB9">
+            <wp:extent cx="4697228" cy="3733800"/>
+            <wp:effectExtent l="0" t="0" r="8255" b="0"/>
+            <wp:docPr id="5" name="Imagen 5"/>
             <wp:cNvGraphicFramePr>
               <a:graphicFrameLocks xmlns:a="http://schemas.openxmlformats.org/drawingml/2006/main" noChangeAspect="1"/>
             </wp:cNvGraphicFramePr>
@@ -1622,7 +667,7 @@
               <a:graphicData uri="http://schemas.openxmlformats.org/drawingml/2006/picture">
                 <pic:pic xmlns:pic="http://schemas.openxmlformats.org/drawingml/2006/picture">
                   <pic:nvPicPr>
-                    <pic:cNvPr id="0" name="image(20260925-151742).png"/>
+                    <pic:cNvPr id="1" name=""/>
                     <pic:cNvPicPr/>
                   </pic:nvPicPr>
                   <pic:blipFill>
@@ -1634,7 +679,302 @@
                   <pic:spPr>
                     <a:xfrm>
                       <a:off x="0" y="0"/>
-                      <a:ext cx="4389120" cy="387714"/>
+                      <a:ext cx="4698444" cy="3734767"/>
+                    </a:xfrm>
+                    <a:prstGeom prst="rect">
+                      <a:avLst/>
+                    </a:prstGeom>
+                  </pic:spPr>
+                </pic:pic>
+              </a:graphicData>
+            </a:graphic>
+          </wp:inline>
+        </w:drawing>
+      </w:r>
+    </w:p>
+    <w:p>
+      <w:pPr>
+        <w:spacing w:after="40"/>
+        <w:jc w:val="center"/>
+        <w:rPr>
+          <w:lang w:val="es-CO"/>
+        </w:rPr>
+      </w:pPr>
+    </w:p>
+    <w:p>
+      <w:pPr>
+        <w:spacing w:after="40"/>
+        <w:jc w:val="center"/>
+        <w:rPr>
+          <w:lang w:val="es-CO"/>
+        </w:rPr>
+      </w:pPr>
+    </w:p>
+    <w:p>
+      <w:pPr>
+        <w:spacing w:after="40"/>
+        <w:jc w:val="center"/>
+        <w:rPr>
+          <w:lang w:val="es-CO"/>
+        </w:rPr>
+      </w:pPr>
+    </w:p>
+    <w:p>
+      <w:pPr>
+        <w:spacing w:after="40"/>
+        <w:jc w:val="center"/>
+        <w:rPr>
+          <w:lang w:val="es-CO"/>
+        </w:rPr>
+      </w:pPr>
+    </w:p>
+    <w:p>
+      <w:pPr>
+        <w:spacing w:after="40"/>
+        <w:jc w:val="center"/>
+        <w:rPr>
+          <w:lang w:val="es-CO"/>
+        </w:rPr>
+      </w:pPr>
+      <w:r>
+        <w:rPr>
+          <w:lang w:val="es-CO"/>
+        </w:rPr>
+        <w:lastRenderedPageBreak/>
+        <w:drawing>
+          <wp:inline distT="0" distB="0" distL="0" distR="0" wp14:anchorId="010AB91E" wp14:editId="5C15BDDB">
+            <wp:extent cx="4651157" cy="3657600"/>
+            <wp:effectExtent l="0" t="0" r="0" b="0"/>
+            <wp:docPr id="6" name="Imagen 6"/>
+            <wp:cNvGraphicFramePr>
+              <a:graphicFrameLocks xmlns:a="http://schemas.openxmlformats.org/drawingml/2006/main" noChangeAspect="1"/>
+            </wp:cNvGraphicFramePr>
+            <a:graphic xmlns:a="http://schemas.openxmlformats.org/drawingml/2006/main">
+              <a:graphicData uri="http://schemas.openxmlformats.org/drawingml/2006/picture">
+                <pic:pic xmlns:pic="http://schemas.openxmlformats.org/drawingml/2006/picture">
+                  <pic:nvPicPr>
+                    <pic:cNvPr id="1" name=""/>
+                    <pic:cNvPicPr/>
+                  </pic:nvPicPr>
+                  <pic:blipFill>
+                    <a:blip r:embed="rId8"/>
+                    <a:stretch>
+                      <a:fillRect/>
+                    </a:stretch>
+                  </pic:blipFill>
+                  <pic:spPr>
+                    <a:xfrm>
+                      <a:off x="0" y="0"/>
+                      <a:ext cx="4655724" cy="3661191"/>
+                    </a:xfrm>
+                    <a:prstGeom prst="rect">
+                      <a:avLst/>
+                    </a:prstGeom>
+                  </pic:spPr>
+                </pic:pic>
+              </a:graphicData>
+            </a:graphic>
+          </wp:inline>
+        </w:drawing>
+      </w:r>
+    </w:p>
+    <w:p>
+      <w:pPr>
+        <w:spacing w:after="40"/>
+        <w:rPr>
+          <w:lang w:val="es-CO"/>
+        </w:rPr>
+      </w:pPr>
+    </w:p>
+    <w:p>
+      <w:pPr>
+        <w:pStyle w:val="Ttulo1"/>
+        <w:spacing w:before="140" w:after="60"/>
+        <w:rPr>
+          <w:lang w:val="es-CO"/>
+        </w:rPr>
+      </w:pPr>
+      <w:r>
+        <w:rPr>
+          <w:lang w:val="es-CO"/>
+        </w:rPr>
+        <w:t>Primera mejora</w:t>
+      </w:r>
+    </w:p>
+    <w:p>
+      <w:pPr>
+        <w:spacing w:after="80" w:line="240" w:lineRule="auto"/>
+        <w:rPr>
+          <w:lang w:val="es-CO"/>
+        </w:rPr>
+      </w:pPr>
+      <w:r>
+        <w:rPr>
+          <w:lang w:val="es-CO"/>
+        </w:rPr>
+        <w:t>Se creó idx_brecha_fecha_severidad sobre fecha_deteccion y severidad_incidente. PostgreSQL lo utiliza para resolver de forma indexada la fecha máxima mediante un Index Only Scan Backward.</w:t>
+      </w:r>
+    </w:p>
+    <w:p>
+      <w:pPr>
+        <w:spacing w:after="100" w:line="240" w:lineRule="auto"/>
+        <w:ind w:left="317"/>
+        <w:rPr>
+          <w:lang w:val="es-CO"/>
+        </w:rPr>
+      </w:pPr>
+      <w:r>
+        <w:rPr>
+          <w:rFonts w:ascii="Consolas" w:hAnsi="Consolas"/>
+          <w:sz w:val="16"/>
+          <w:lang w:val="es-CO"/>
+        </w:rPr>
+        <w:t>create index idx_brecha_fecha_severidad</w:t>
+      </w:r>
+      <w:r>
+        <w:rPr>
+          <w:lang w:val="es-CO"/>
+        </w:rPr>
+        <w:br/>
+      </w:r>
+      <w:r>
+        <w:rPr>
+          <w:rFonts w:ascii="Consolas" w:hAnsi="Consolas"/>
+          <w:sz w:val="16"/>
+          <w:lang w:val="es-CO"/>
+        </w:rPr>
+        <w:t>on brechas_seguridad.brecha (</w:t>
+      </w:r>
+      <w:r>
+        <w:rPr>
+          <w:lang w:val="es-CO"/>
+        </w:rPr>
+        <w:br/>
+      </w:r>
+      <w:r>
+        <w:rPr>
+          <w:rFonts w:ascii="Consolas" w:hAnsi="Consolas"/>
+          <w:sz w:val="16"/>
+          <w:lang w:val="es-CO"/>
+        </w:rPr>
+        <w:t xml:space="preserve">    fecha_deteccion,</w:t>
+      </w:r>
+      <w:r>
+        <w:rPr>
+          <w:lang w:val="es-CO"/>
+        </w:rPr>
+        <w:br/>
+      </w:r>
+      <w:r>
+        <w:rPr>
+          <w:rFonts w:ascii="Consolas" w:hAnsi="Consolas"/>
+          <w:sz w:val="16"/>
+          <w:lang w:val="es-CO"/>
+        </w:rPr>
+        <w:t xml:space="preserve">    severidad_incidente</w:t>
+      </w:r>
+      <w:r>
+        <w:rPr>
+          <w:lang w:val="es-CO"/>
+        </w:rPr>
+        <w:br/>
+      </w:r>
+      <w:r>
+        <w:rPr>
+          <w:rFonts w:ascii="Consolas" w:hAnsi="Consolas"/>
+          <w:sz w:val="16"/>
+          <w:lang w:val="es-CO"/>
+        </w:rPr>
+        <w:t>);</w:t>
+      </w:r>
+    </w:p>
+    <w:p>
+      <w:pPr>
+        <w:spacing w:after="80" w:line="240" w:lineRule="auto"/>
+        <w:rPr>
+          <w:lang w:val="es-CO"/>
+        </w:rPr>
+      </w:pPr>
+      <w:r>
+        <w:rPr>
+          <w:lang w:val="es-CO"/>
+        </w:rPr>
+        <w:t>Con este índice, el Execution Time bajó de 15.543 ms a 14.795 ms en la ejecución registrada, una reducción aproximada del 4.8%.</w:t>
+      </w:r>
+    </w:p>
+    <w:p>
+      <w:pPr>
+        <w:spacing w:after="40"/>
+      </w:pPr>
+      <w:r>
+        <w:drawing>
+          <wp:inline distT="0" distB="0" distL="0" distR="0" wp14:anchorId="1F371B48" wp14:editId="78575398">
+            <wp:extent cx="4792980" cy="2944983"/>
+            <wp:effectExtent l="0" t="0" r="7620" b="8255"/>
+            <wp:docPr id="7" name="Imagen 7"/>
+            <wp:cNvGraphicFramePr>
+              <a:graphicFrameLocks xmlns:a="http://schemas.openxmlformats.org/drawingml/2006/main" noChangeAspect="1"/>
+            </wp:cNvGraphicFramePr>
+            <a:graphic xmlns:a="http://schemas.openxmlformats.org/drawingml/2006/main">
+              <a:graphicData uri="http://schemas.openxmlformats.org/drawingml/2006/picture">
+                <pic:pic xmlns:pic="http://schemas.openxmlformats.org/drawingml/2006/picture">
+                  <pic:nvPicPr>
+                    <pic:cNvPr id="1" name=""/>
+                    <pic:cNvPicPr/>
+                  </pic:nvPicPr>
+                  <pic:blipFill>
+                    <a:blip r:embed="rId9"/>
+                    <a:stretch>
+                      <a:fillRect/>
+                    </a:stretch>
+                  </pic:blipFill>
+                  <pic:spPr>
+                    <a:xfrm>
+                      <a:off x="0" y="0"/>
+                      <a:ext cx="4802615" cy="2950903"/>
+                    </a:xfrm>
+                    <a:prstGeom prst="rect">
+                      <a:avLst/>
+                    </a:prstGeom>
+                  </pic:spPr>
+                </pic:pic>
+              </a:graphicData>
+            </a:graphic>
+          </wp:inline>
+        </w:drawing>
+      </w:r>
+    </w:p>
+    <w:p>
+      <w:pPr>
+        <w:spacing w:after="40"/>
+      </w:pPr>
+      <w:r>
+        <w:lastRenderedPageBreak/>
+        <w:drawing>
+          <wp:inline distT="0" distB="0" distL="0" distR="0" wp14:anchorId="2AB03DA4" wp14:editId="6EA40397">
+            <wp:extent cx="4533900" cy="2613733"/>
+            <wp:effectExtent l="0" t="0" r="0" b="0"/>
+            <wp:docPr id="8" name="Imagen 8"/>
+            <wp:cNvGraphicFramePr>
+              <a:graphicFrameLocks xmlns:a="http://schemas.openxmlformats.org/drawingml/2006/main" noChangeAspect="1"/>
+            </wp:cNvGraphicFramePr>
+            <a:graphic xmlns:a="http://schemas.openxmlformats.org/drawingml/2006/main">
+              <a:graphicData uri="http://schemas.openxmlformats.org/drawingml/2006/picture">
+                <pic:pic xmlns:pic="http://schemas.openxmlformats.org/drawingml/2006/picture">
+                  <pic:nvPicPr>
+                    <pic:cNvPr id="1" name=""/>
+                    <pic:cNvPicPr/>
+                  </pic:nvPicPr>
+                  <pic:blipFill>
+                    <a:blip r:embed="rId10"/>
+                    <a:stretch>
+                      <a:fillRect/>
+                    </a:stretch>
+                  </pic:blipFill>
+                  <pic:spPr>
+                    <a:xfrm>
+                      <a:off x="0" y="0"/>
+                      <a:ext cx="4543252" cy="2619124"/>
                     </a:xfrm>
                     <a:prstGeom prst="rect">
                       <a:avLst/>
@@ -1659,13 +999,7 @@
         <w:rPr>
           <w:lang w:val="es-CO"/>
         </w:rPr>
-        <w:t>Primera me</w:t>
-      </w:r>
-      <w:r>
-        <w:rPr>
-          <w:lang w:val="es-CO"/>
-        </w:rPr>
-        <w:t>jora</w:t>
+        <w:t>Segunda mejora evaluada</w:t>
       </w:r>
     </w:p>
     <w:p>
@@ -1679,105 +1013,7 @@
         <w:rPr>
           <w:lang w:val="es-CO"/>
         </w:rPr>
-        <w:t xml:space="preserve">Se creó </w:t>
-      </w:r>
-      <w:proofErr w:type="spellStart"/>
-      <w:r>
-        <w:rPr>
-          <w:lang w:val="es-CO"/>
-        </w:rPr>
-        <w:t>idx_brecha_fecha_severidad</w:t>
-      </w:r>
-      <w:proofErr w:type="spellEnd"/>
-      <w:r>
-        <w:rPr>
-          <w:lang w:val="es-CO"/>
-        </w:rPr>
-        <w:t xml:space="preserve"> sobre </w:t>
-      </w:r>
-      <w:proofErr w:type="spellStart"/>
-      <w:r>
-        <w:rPr>
-          <w:lang w:val="es-CO"/>
-        </w:rPr>
-        <w:t>fecha_deteccion</w:t>
-      </w:r>
-      <w:proofErr w:type="spellEnd"/>
-      <w:r>
-        <w:rPr>
-          <w:lang w:val="es-CO"/>
-        </w:rPr>
-        <w:t xml:space="preserve"> y </w:t>
-      </w:r>
-      <w:proofErr w:type="spellStart"/>
-      <w:r>
-        <w:rPr>
-          <w:lang w:val="es-CO"/>
-        </w:rPr>
-        <w:t>severidad_incidente</w:t>
-      </w:r>
-      <w:proofErr w:type="spellEnd"/>
-      <w:r>
-        <w:rPr>
-          <w:lang w:val="es-CO"/>
-        </w:rPr>
-        <w:t xml:space="preserve">. PostgreSQL lo utiliza para resolver de forma indexada la fecha máxima mediante un </w:t>
-      </w:r>
-      <w:proofErr w:type="spellStart"/>
-      <w:r>
-        <w:rPr>
-          <w:lang w:val="es-CO"/>
-        </w:rPr>
-        <w:t>Index</w:t>
-      </w:r>
-      <w:proofErr w:type="spellEnd"/>
-      <w:r>
-        <w:rPr>
-          <w:lang w:val="es-CO"/>
-        </w:rPr>
-        <w:t xml:space="preserve"> </w:t>
-      </w:r>
-      <w:proofErr w:type="spellStart"/>
-      <w:r>
-        <w:rPr>
-          <w:lang w:val="es-CO"/>
-        </w:rPr>
-        <w:t>Only</w:t>
-      </w:r>
-      <w:proofErr w:type="spellEnd"/>
-      <w:r>
-        <w:rPr>
-          <w:lang w:val="es-CO"/>
-        </w:rPr>
-        <w:t xml:space="preserve"> </w:t>
-      </w:r>
-      <w:proofErr w:type="spellStart"/>
-      <w:r>
-        <w:rPr>
-          <w:lang w:val="es-CO"/>
-        </w:rPr>
-        <w:t>Scan</w:t>
-      </w:r>
-      <w:proofErr w:type="spellEnd"/>
-      <w:r>
-        <w:rPr>
-          <w:lang w:val="es-CO"/>
-        </w:rPr>
-        <w:t xml:space="preserve"> </w:t>
-      </w:r>
-      <w:proofErr w:type="spellStart"/>
-      <w:r>
-        <w:rPr>
-          <w:lang w:val="es-CO"/>
-        </w:rPr>
-        <w:t>Backward</w:t>
-      </w:r>
-      <w:proofErr w:type="spellEnd"/>
-      <w:r>
-        <w:rPr>
-          <w:lang w:val="es-CO"/>
-        </w:rPr>
-        <w:t>.</w:t>
+        <w:t>También se evaluó idx_exposicion_brecha_tipo_usuario. Sin embargo, en el plan corregido con EXISTS PostgreSQL no seleccionó este índice; para la tabla de exposición utilizó la PK existente y un recorrido secuencial dentro del EXISTS.</w:t>
       </w:r>
     </w:p>
     <w:p>
@@ -1788,168 +1024,70 @@
           <w:lang w:val="es-CO"/>
         </w:rPr>
       </w:pPr>
-      <w:proofErr w:type="spellStart"/>
       <w:r>
         <w:rPr>
           <w:rFonts w:ascii="Consolas" w:hAnsi="Consolas"/>
           <w:sz w:val="16"/>
           <w:lang w:val="es-CO"/>
         </w:rPr>
-        <w:t>create</w:t>
+        <w:t>create index idx_exposicion_brecha_tipo_usuario</w:t>
       </w:r>
-      <w:proofErr w:type="spellEnd"/>
+      <w:r>
+        <w:rPr>
+          <w:lang w:val="es-CO"/>
+        </w:rPr>
+        <w:br/>
+      </w:r>
       <w:r>
         <w:rPr>
           <w:rFonts w:ascii="Consolas" w:hAnsi="Consolas"/>
           <w:sz w:val="16"/>
           <w:lang w:val="es-CO"/>
         </w:rPr>
-        <w:t xml:space="preserve"> </w:t>
+        <w:t>on brechas_seguridad.exposicion_usuario_brecha (</w:t>
       </w:r>
-      <w:proofErr w:type="spellStart"/>
+      <w:r>
+        <w:rPr>
+          <w:lang w:val="es-CO"/>
+        </w:rPr>
+        <w:br/>
+      </w:r>
       <w:r>
         <w:rPr>
           <w:rFonts w:ascii="Consolas" w:hAnsi="Consolas"/>
           <w:sz w:val="16"/>
           <w:lang w:val="es-CO"/>
         </w:rPr>
-        <w:t>index</w:t>
+        <w:t xml:space="preserve">    codigo_brecha,</w:t>
       </w:r>
-      <w:proofErr w:type="spellEnd"/>
+      <w:r>
+        <w:rPr>
+          <w:lang w:val="es-CO"/>
+        </w:rPr>
+        <w:br/>
+      </w:r>
       <w:r>
         <w:rPr>
           <w:rFonts w:ascii="Consolas" w:hAnsi="Consolas"/>
           <w:sz w:val="16"/>
           <w:lang w:val="es-CO"/>
         </w:rPr>
-        <w:t xml:space="preserve"> </w:t>
+        <w:t xml:space="preserve">    id_tipo_dato,</w:t>
       </w:r>
-      <w:proofErr w:type="spellStart"/>
+      <w:r>
+        <w:rPr>
+          <w:lang w:val="es-CO"/>
+        </w:rPr>
+        <w:br/>
+      </w:r>
       <w:r>
         <w:rPr>
           <w:rFonts w:ascii="Consolas" w:hAnsi="Consolas"/>
           <w:sz w:val="16"/>
           <w:lang w:val="es-CO"/>
         </w:rPr>
-        <w:t>idx_brecha_fecha_severidad</w:t>
+        <w:t xml:space="preserve">    codigo_usuario</w:t>
       </w:r>
-      <w:proofErr w:type="spellEnd"/>
-      <w:r>
-        <w:rPr>
-          <w:lang w:val="es-CO"/>
-        </w:rPr>
-        <w:br/>
-      </w:r>
-      <w:proofErr w:type="spellStart"/>
-      <w:r>
-        <w:rPr>
-          <w:rFonts w:ascii="Consolas" w:hAnsi="Consolas"/>
-          <w:sz w:val="16"/>
-          <w:lang w:val="es-CO"/>
-        </w:rPr>
-        <w:t>on</w:t>
-      </w:r>
-      <w:proofErr w:type="spellEnd"/>
-      <w:r>
-        <w:rPr>
-          <w:rFonts w:ascii="Consolas" w:hAnsi="Consolas"/>
-          <w:sz w:val="16"/>
-          <w:lang w:val="es-CO"/>
-        </w:rPr>
-        <w:t xml:space="preserve"> </w:t>
-      </w:r>
-      <w:proofErr w:type="spellStart"/>
-      <w:r>
-        <w:rPr>
-          <w:rFonts w:ascii="Consolas" w:hAnsi="Consolas"/>
-          <w:sz w:val="16"/>
-          <w:lang w:val="es-CO"/>
-        </w:rPr>
-        <w:t>brechas_</w:t>
-      </w:r>
-      <w:proofErr w:type="gramStart"/>
-      <w:r>
-        <w:rPr>
-          <w:rFonts w:ascii="Consolas" w:hAnsi="Consolas"/>
-          <w:sz w:val="16"/>
-          <w:lang w:val="es-CO"/>
-        </w:rPr>
-        <w:t>seguridad.br</w:t>
-      </w:r>
-      <w:r>
-        <w:rPr>
-          <w:rFonts w:ascii="Consolas" w:hAnsi="Consolas"/>
-          <w:sz w:val="16"/>
-          <w:lang w:val="es-CO"/>
-        </w:rPr>
-        <w:t>echa</w:t>
-      </w:r>
-      <w:proofErr w:type="spellEnd"/>
-      <w:proofErr w:type="gramEnd"/>
-      <w:r>
-        <w:rPr>
-          <w:rFonts w:ascii="Consolas" w:hAnsi="Consolas"/>
-          <w:sz w:val="16"/>
-          <w:lang w:val="es-CO"/>
-        </w:rPr>
-        <w:t xml:space="preserve"> (</w:t>
-      </w:r>
-      <w:r>
-        <w:rPr>
-          <w:lang w:val="es-CO"/>
-        </w:rPr>
-        <w:br/>
-      </w:r>
-      <w:r>
-        <w:rPr>
-          <w:rFonts w:ascii="Consolas" w:hAnsi="Consolas"/>
-          <w:sz w:val="16"/>
-          <w:lang w:val="es-CO"/>
-        </w:rPr>
-        <w:t xml:space="preserve">    </w:t>
-      </w:r>
-      <w:proofErr w:type="spellStart"/>
-      <w:r>
-        <w:rPr>
-          <w:rFonts w:ascii="Consolas" w:hAnsi="Consolas"/>
-          <w:sz w:val="16"/>
-          <w:lang w:val="es-CO"/>
-        </w:rPr>
-        <w:t>fecha_deteccion</w:t>
-      </w:r>
-      <w:proofErr w:type="spellEnd"/>
-      <w:r>
-        <w:rPr>
-          <w:rFonts w:ascii="Consolas" w:hAnsi="Consolas"/>
-          <w:sz w:val="16"/>
-          <w:lang w:val="es-CO"/>
-        </w:rPr>
-        <w:t>,</w:t>
-      </w:r>
-      <w:r>
-        <w:rPr>
-          <w:lang w:val="es-CO"/>
-        </w:rPr>
-        <w:br/>
-      </w:r>
-      <w:r>
-        <w:rPr>
-          <w:rFonts w:ascii="Consolas" w:hAnsi="Consolas"/>
-          <w:sz w:val="16"/>
-          <w:lang w:val="es-CO"/>
-        </w:rPr>
-        <w:t xml:space="preserve">    </w:t>
-      </w:r>
-      <w:proofErr w:type="spellStart"/>
-      <w:r>
-        <w:rPr>
-          <w:rFonts w:ascii="Consolas" w:hAnsi="Consolas"/>
-          <w:sz w:val="16"/>
-          <w:lang w:val="es-CO"/>
-        </w:rPr>
-        <w:t>severidad_incidente</w:t>
-      </w:r>
-      <w:proofErr w:type="spellEnd"/>
       <w:r>
         <w:rPr>
           <w:lang w:val="es-CO"/>
@@ -1976,21 +1114,59 @@
         <w:rPr>
           <w:lang w:val="es-CO"/>
         </w:rPr>
-        <w:t xml:space="preserve">Con este índice, el </w:t>
+        <w:t>Con ambos índices el Execution Time fue de 15.442 ms. Frente a la ejecución base, la reducción fue de aproximadamente 0.6%; frente al escenario con un solo índice, la ejecución fue 4.4% más lenta. Por lo tanto, no se atribuye una mejora real al segundo índice.</w:t>
       </w:r>
-      <w:proofErr w:type="spellStart"/>
+    </w:p>
+    <w:p>
+      <w:pPr>
+        <w:spacing w:after="40"/>
+        <w:jc w:val="center"/>
+        <w:rPr>
+          <w:noProof/>
+        </w:rPr>
+      </w:pPr>
+    </w:p>
+    <w:p>
+      <w:pPr>
+        <w:spacing w:after="40"/>
+        <w:jc w:val="center"/>
+      </w:pPr>
       <w:r>
-        <w:rPr>
-          <w:lang w:val="es-CO"/>
-        </w:rPr>
-        <w:t>Execution</w:t>
-      </w:r>
-      <w:proofErr w:type="spellEnd"/>
-      <w:r>
-        <w:rPr>
-          <w:lang w:val="es-CO"/>
-        </w:rPr>
-        <w:t xml:space="preserve"> Time bajó de 17.767 ms a 15.530 ms en la ejecución registrada, una reducción aproximada del 12.6%.</w:t>
+        <w:drawing>
+          <wp:inline distT="0" distB="0" distL="0" distR="0" wp14:anchorId="7DADB117" wp14:editId="4509E57F">
+            <wp:extent cx="4732020" cy="2823753"/>
+            <wp:effectExtent l="0" t="0" r="0" b="0"/>
+            <wp:docPr id="9" name="Imagen 9"/>
+            <wp:cNvGraphicFramePr>
+              <a:graphicFrameLocks xmlns:a="http://schemas.openxmlformats.org/drawingml/2006/main" noChangeAspect="1"/>
+            </wp:cNvGraphicFramePr>
+            <a:graphic xmlns:a="http://schemas.openxmlformats.org/drawingml/2006/main">
+              <a:graphicData uri="http://schemas.openxmlformats.org/drawingml/2006/picture">
+                <pic:pic xmlns:pic="http://schemas.openxmlformats.org/drawingml/2006/picture">
+                  <pic:nvPicPr>
+                    <pic:cNvPr id="1" name=""/>
+                    <pic:cNvPicPr/>
+                  </pic:nvPicPr>
+                  <pic:blipFill>
+                    <a:blip r:embed="rId11"/>
+                    <a:stretch>
+                      <a:fillRect/>
+                    </a:stretch>
+                  </pic:blipFill>
+                  <pic:spPr>
+                    <a:xfrm>
+                      <a:off x="0" y="0"/>
+                      <a:ext cx="4738302" cy="2827502"/>
+                    </a:xfrm>
+                    <a:prstGeom prst="rect">
+                      <a:avLst/>
+                    </a:prstGeom>
+                  </pic:spPr>
+                </pic:pic>
+              </a:graphicData>
+            </a:graphic>
+          </wp:inline>
+        </w:drawing>
       </w:r>
     </w:p>
     <w:p>
@@ -1999,14 +1175,12 @@
         <w:jc w:val="center"/>
       </w:pPr>
       <w:r>
-        <w:rPr>
-          <w:noProof/>
-        </w:rPr>
+        <w:lastRenderedPageBreak/>
         <w:drawing>
-          <wp:inline distT="0" distB="0" distL="0" distR="0" wp14:anchorId="24FC3492" wp14:editId="7A798EEA">
-            <wp:extent cx="4937760" cy="533812"/>
-            <wp:effectExtent l="0" t="0" r="0" b="0"/>
-            <wp:docPr id="3" name="Picture 3"/>
+          <wp:inline distT="0" distB="0" distL="0" distR="0" wp14:anchorId="2CD7CA25" wp14:editId="63D13E74">
+            <wp:extent cx="4983480" cy="2813443"/>
+            <wp:effectExtent l="0" t="0" r="7620" b="6350"/>
+            <wp:docPr id="10" name="Imagen 10"/>
             <wp:cNvGraphicFramePr>
               <a:graphicFrameLocks xmlns:a="http://schemas.openxmlformats.org/drawingml/2006/main" noChangeAspect="1"/>
             </wp:cNvGraphicFramePr>
@@ -2014,11 +1188,11 @@
               <a:graphicData uri="http://schemas.openxmlformats.org/drawingml/2006/picture">
                 <pic:pic xmlns:pic="http://schemas.openxmlformats.org/drawingml/2006/picture">
                   <pic:nvPicPr>
-                    <pic:cNvPr id="0" name="image(20260925-151817).png"/>
+                    <pic:cNvPr id="1" name=""/>
                     <pic:cNvPicPr/>
                   </pic:nvPicPr>
                   <pic:blipFill>
-                    <a:blip r:embed="rId8"/>
+                    <a:blip r:embed="rId12"/>
                     <a:stretch>
                       <a:fillRect/>
                     </a:stretch>
@@ -2026,7 +1200,7 @@
                   <pic:spPr>
                     <a:xfrm>
                       <a:off x="0" y="0"/>
-                      <a:ext cx="4937760" cy="533812"/>
+                      <a:ext cx="4987404" cy="2815658"/>
                     </a:xfrm>
                     <a:prstGeom prst="rect">
                       <a:avLst/>
@@ -2051,353 +1225,6 @@
         <w:rPr>
           <w:lang w:val="es-CO"/>
         </w:rPr>
-        <w:t>Segunda mejora evaluad</w:t>
-      </w:r>
-      <w:r>
-        <w:rPr>
-          <w:lang w:val="es-CO"/>
-        </w:rPr>
-        <w:t>a</w:t>
-      </w:r>
-    </w:p>
-    <w:p>
-      <w:pPr>
-        <w:spacing w:after="80" w:line="240" w:lineRule="auto"/>
-        <w:rPr>
-          <w:lang w:val="es-CO"/>
-        </w:rPr>
-      </w:pPr>
-      <w:r>
-        <w:rPr>
-          <w:lang w:val="es-CO"/>
-        </w:rPr>
-        <w:t xml:space="preserve">También se evaluó </w:t>
-      </w:r>
-      <w:proofErr w:type="spellStart"/>
-      <w:r>
-        <w:rPr>
-          <w:lang w:val="es-CO"/>
-        </w:rPr>
-        <w:t>idx_exposicion_brecha_tipo_usuario</w:t>
-      </w:r>
-      <w:proofErr w:type="spellEnd"/>
-      <w:r>
-        <w:rPr>
-          <w:lang w:val="es-CO"/>
-        </w:rPr>
-        <w:t>. Sin embargo, en el plan corregido con EXISTS PostgreSQL no seleccionó este índice; para la tabla de exposición utilizó la PK existente y un recorrido secuencial dentro del EXISTS.</w:t>
-      </w:r>
-    </w:p>
-    <w:p>
-      <w:pPr>
-        <w:spacing w:after="100" w:line="240" w:lineRule="auto"/>
-        <w:ind w:left="317"/>
-        <w:rPr>
-          <w:lang w:val="es-CO"/>
-        </w:rPr>
-      </w:pPr>
-      <w:proofErr w:type="spellStart"/>
-      <w:r>
-        <w:rPr>
-          <w:rFonts w:ascii="Consolas" w:hAnsi="Consolas"/>
-          <w:sz w:val="16"/>
-          <w:lang w:val="es-CO"/>
-        </w:rPr>
-        <w:t>create</w:t>
-      </w:r>
-      <w:proofErr w:type="spellEnd"/>
-      <w:r>
-        <w:rPr>
-          <w:rFonts w:ascii="Consolas" w:hAnsi="Consolas"/>
-          <w:sz w:val="16"/>
-          <w:lang w:val="es-CO"/>
-        </w:rPr>
-        <w:t xml:space="preserve"> </w:t>
-      </w:r>
-      <w:proofErr w:type="spellStart"/>
-      <w:r>
-        <w:rPr>
-          <w:rFonts w:ascii="Consolas" w:hAnsi="Consolas"/>
-          <w:sz w:val="16"/>
-          <w:lang w:val="es-CO"/>
-        </w:rPr>
-        <w:t>index</w:t>
-      </w:r>
-      <w:proofErr w:type="spellEnd"/>
-      <w:r>
-        <w:rPr>
-          <w:rFonts w:ascii="Consolas" w:hAnsi="Consolas"/>
-          <w:sz w:val="16"/>
-          <w:lang w:val="es-CO"/>
-        </w:rPr>
-        <w:t xml:space="preserve"> </w:t>
-      </w:r>
-      <w:proofErr w:type="spellStart"/>
-      <w:r>
-        <w:rPr>
-          <w:rFonts w:ascii="Consolas" w:hAnsi="Consolas"/>
-          <w:sz w:val="16"/>
-          <w:lang w:val="es-CO"/>
-        </w:rPr>
-        <w:t>idx_exposicion_brecha_tipo_usuario</w:t>
-      </w:r>
-      <w:proofErr w:type="spellEnd"/>
-      <w:r>
-        <w:rPr>
-          <w:lang w:val="es-CO"/>
-        </w:rPr>
-        <w:br/>
-      </w:r>
-      <w:proofErr w:type="spellStart"/>
-      <w:r>
-        <w:rPr>
-          <w:rFonts w:ascii="Consolas" w:hAnsi="Consolas"/>
-          <w:sz w:val="16"/>
-          <w:lang w:val="es-CO"/>
-        </w:rPr>
-        <w:t>on</w:t>
-      </w:r>
-      <w:proofErr w:type="spellEnd"/>
-      <w:r>
-        <w:rPr>
-          <w:rFonts w:ascii="Consolas" w:hAnsi="Consolas"/>
-          <w:sz w:val="16"/>
-          <w:lang w:val="es-CO"/>
-        </w:rPr>
-        <w:t xml:space="preserve"> </w:t>
-      </w:r>
-      <w:proofErr w:type="spellStart"/>
-      <w:r>
-        <w:rPr>
-          <w:rFonts w:ascii="Consolas" w:hAnsi="Consolas"/>
-          <w:sz w:val="16"/>
-          <w:lang w:val="es-CO"/>
-        </w:rPr>
-        <w:t>brechas_</w:t>
-      </w:r>
-      <w:proofErr w:type="gramStart"/>
-      <w:r>
-        <w:rPr>
-          <w:rFonts w:ascii="Consolas" w:hAnsi="Consolas"/>
-          <w:sz w:val="16"/>
-          <w:lang w:val="es-CO"/>
-        </w:rPr>
-        <w:t>seguridad.exposicion</w:t>
-      </w:r>
-      <w:proofErr w:type="gramEnd"/>
-      <w:r>
-        <w:rPr>
-          <w:rFonts w:ascii="Consolas" w:hAnsi="Consolas"/>
-          <w:sz w:val="16"/>
-          <w:lang w:val="es-CO"/>
-        </w:rPr>
-        <w:t>_usuario_brecha</w:t>
-      </w:r>
-      <w:proofErr w:type="spellEnd"/>
-      <w:r>
-        <w:rPr>
-          <w:rFonts w:ascii="Consolas" w:hAnsi="Consolas"/>
-          <w:sz w:val="16"/>
-          <w:lang w:val="es-CO"/>
-        </w:rPr>
-        <w:t xml:space="preserve"> (</w:t>
-      </w:r>
-      <w:r>
-        <w:rPr>
-          <w:lang w:val="es-CO"/>
-        </w:rPr>
-        <w:br/>
-      </w:r>
-      <w:r>
-        <w:rPr>
-          <w:rFonts w:ascii="Consolas" w:hAnsi="Consolas"/>
-          <w:sz w:val="16"/>
-          <w:lang w:val="es-CO"/>
-        </w:rPr>
-        <w:t xml:space="preserve">    </w:t>
-      </w:r>
-      <w:proofErr w:type="spellStart"/>
-      <w:r>
-        <w:rPr>
-          <w:rFonts w:ascii="Consolas" w:hAnsi="Consolas"/>
-          <w:sz w:val="16"/>
-          <w:lang w:val="es-CO"/>
-        </w:rPr>
-        <w:t>codigo_brecha</w:t>
-      </w:r>
-      <w:proofErr w:type="spellEnd"/>
-      <w:r>
-        <w:rPr>
-          <w:rFonts w:ascii="Consolas" w:hAnsi="Consolas"/>
-          <w:sz w:val="16"/>
-          <w:lang w:val="es-CO"/>
-        </w:rPr>
-        <w:t>,</w:t>
-      </w:r>
-      <w:r>
-        <w:rPr>
-          <w:lang w:val="es-CO"/>
-        </w:rPr>
-        <w:br/>
-      </w:r>
-      <w:r>
-        <w:rPr>
-          <w:rFonts w:ascii="Consolas" w:hAnsi="Consolas"/>
-          <w:sz w:val="16"/>
-          <w:lang w:val="es-CO"/>
-        </w:rPr>
-        <w:t xml:space="preserve">    </w:t>
-      </w:r>
-      <w:proofErr w:type="spellStart"/>
-      <w:r>
-        <w:rPr>
-          <w:rFonts w:ascii="Consolas" w:hAnsi="Consolas"/>
-          <w:sz w:val="16"/>
-          <w:lang w:val="es-CO"/>
-        </w:rPr>
-        <w:t>id_tipo_dato</w:t>
-      </w:r>
-      <w:proofErr w:type="spellEnd"/>
-      <w:r>
-        <w:rPr>
-          <w:rFonts w:ascii="Consolas" w:hAnsi="Consolas"/>
-          <w:sz w:val="16"/>
-          <w:lang w:val="es-CO"/>
-        </w:rPr>
-        <w:t>,</w:t>
-      </w:r>
-      <w:r>
-        <w:rPr>
-          <w:lang w:val="es-CO"/>
-        </w:rPr>
-        <w:br/>
-      </w:r>
-      <w:r>
-        <w:rPr>
-          <w:rFonts w:ascii="Consolas" w:hAnsi="Consolas"/>
-          <w:sz w:val="16"/>
-          <w:lang w:val="es-CO"/>
-        </w:rPr>
-        <w:t xml:space="preserve">    </w:t>
-      </w:r>
-      <w:proofErr w:type="spellStart"/>
-      <w:r>
-        <w:rPr>
-          <w:rFonts w:ascii="Consolas" w:hAnsi="Consolas"/>
-          <w:sz w:val="16"/>
-          <w:lang w:val="es-CO"/>
-        </w:rPr>
-        <w:t>codigo_usuario</w:t>
-      </w:r>
-      <w:proofErr w:type="spellEnd"/>
-      <w:r>
-        <w:rPr>
-          <w:lang w:val="es-CO"/>
-        </w:rPr>
-        <w:br/>
-      </w:r>
-      <w:r>
-        <w:rPr>
-          <w:rFonts w:ascii="Consolas" w:hAnsi="Consolas"/>
-          <w:sz w:val="16"/>
-          <w:lang w:val="es-CO"/>
-        </w:rPr>
-        <w:t>);</w:t>
-      </w:r>
-    </w:p>
-    <w:p>
-      <w:pPr>
-        <w:spacing w:after="80" w:line="240" w:lineRule="auto"/>
-        <w:rPr>
-          <w:lang w:val="es-CO"/>
-        </w:rPr>
-      </w:pPr>
-      <w:r>
-        <w:rPr>
-          <w:lang w:val="es-CO"/>
-        </w:rPr>
-        <w:t xml:space="preserve">Con ambos índices el </w:t>
-      </w:r>
-      <w:proofErr w:type="spellStart"/>
-      <w:r>
-        <w:rPr>
-          <w:lang w:val="es-CO"/>
-        </w:rPr>
-        <w:t>Execution</w:t>
-      </w:r>
-      <w:proofErr w:type="spellEnd"/>
-      <w:r>
-        <w:rPr>
-          <w:lang w:val="es-CO"/>
-        </w:rPr>
-        <w:t xml:space="preserve"> Time fue de 15.288 ms. La diferencia adicional frente al primer índice fue mínima,</w:t>
-      </w:r>
-      <w:r>
-        <w:rPr>
-          <w:lang w:val="es-CO"/>
-        </w:rPr>
-        <w:t xml:space="preserve"> por lo que no se atribuye una mejora real al segundo índice.</w:t>
-      </w:r>
-    </w:p>
-    <w:p>
-      <w:pPr>
-        <w:spacing w:after="40"/>
-        <w:jc w:val="center"/>
-      </w:pPr>
-      <w:r>
-        <w:rPr>
-          <w:noProof/>
-        </w:rPr>
-        <w:lastRenderedPageBreak/>
-        <w:drawing>
-          <wp:inline distT="0" distB="0" distL="0" distR="0" wp14:anchorId="246CAAF5" wp14:editId="77E74DE5">
-            <wp:extent cx="4937760" cy="1807192"/>
-            <wp:effectExtent l="0" t="0" r="0" b="0"/>
-            <wp:docPr id="4" name="Picture 4"/>
-            <wp:cNvGraphicFramePr>
-              <a:graphicFrameLocks xmlns:a="http://schemas.openxmlformats.org/drawingml/2006/main" noChangeAspect="1"/>
-            </wp:cNvGraphicFramePr>
-            <a:graphic xmlns:a="http://schemas.openxmlformats.org/drawingml/2006/main">
-              <a:graphicData uri="http://schemas.openxmlformats.org/drawingml/2006/picture">
-                <pic:pic xmlns:pic="http://schemas.openxmlformats.org/drawingml/2006/picture">
-                  <pic:nvPicPr>
-                    <pic:cNvPr id="0" name="image(20260925-152000).png"/>
-                    <pic:cNvPicPr/>
-                  </pic:nvPicPr>
-                  <pic:blipFill>
-                    <a:blip r:embed="rId9"/>
-                    <a:stretch>
-                      <a:fillRect/>
-                    </a:stretch>
-                  </pic:blipFill>
-                  <pic:spPr>
-                    <a:xfrm>
-                      <a:off x="0" y="0"/>
-                      <a:ext cx="4937760" cy="1807192"/>
-                    </a:xfrm>
-                    <a:prstGeom prst="rect">
-                      <a:avLst/>
-                    </a:prstGeom>
-                  </pic:spPr>
-                </pic:pic>
-              </a:graphicData>
-            </a:graphic>
-          </wp:inline>
-        </w:drawing>
-      </w:r>
-    </w:p>
-    <w:p>
-      <w:pPr>
-        <w:pStyle w:val="Ttulo1"/>
-        <w:spacing w:before="140" w:after="60"/>
-        <w:rPr>
-          <w:lang w:val="es-CO"/>
-        </w:rPr>
-      </w:pPr>
-      <w:r>
-        <w:rPr>
-          <w:lang w:val="es-CO"/>
-        </w:rPr>
         <w:t>Plan final observado</w:t>
       </w:r>
     </w:p>
@@ -2412,97 +1239,7 @@
         <w:rPr>
           <w:lang w:val="es-CO"/>
         </w:rPr>
-        <w:t xml:space="preserve">El plan final confirma el uso de </w:t>
-      </w:r>
-      <w:proofErr w:type="spellStart"/>
-      <w:r>
-        <w:rPr>
-          <w:lang w:val="es-CO"/>
-        </w:rPr>
-        <w:t>idx_brecha_fecha_severidad</w:t>
-      </w:r>
-      <w:proofErr w:type="spellEnd"/>
-      <w:r>
-        <w:rPr>
-          <w:lang w:val="es-CO"/>
-        </w:rPr>
-        <w:t xml:space="preserve"> mediante </w:t>
-      </w:r>
-      <w:proofErr w:type="spellStart"/>
-      <w:r>
-        <w:rPr>
-          <w:lang w:val="es-CO"/>
-        </w:rPr>
-        <w:t>Index</w:t>
-      </w:r>
-      <w:proofErr w:type="spellEnd"/>
-      <w:r>
-        <w:rPr>
-          <w:lang w:val="es-CO"/>
-        </w:rPr>
-        <w:t xml:space="preserve"> </w:t>
-      </w:r>
-      <w:proofErr w:type="spellStart"/>
-      <w:r>
-        <w:rPr>
-          <w:lang w:val="es-CO"/>
-        </w:rPr>
-        <w:t>Only</w:t>
-      </w:r>
-      <w:proofErr w:type="spellEnd"/>
-      <w:r>
-        <w:rPr>
-          <w:lang w:val="es-CO"/>
-        </w:rPr>
-        <w:t xml:space="preserve"> </w:t>
-      </w:r>
-      <w:proofErr w:type="spellStart"/>
-      <w:r>
-        <w:rPr>
-          <w:lang w:val="es-CO"/>
-        </w:rPr>
-        <w:t>Scan</w:t>
-      </w:r>
-      <w:proofErr w:type="spellEnd"/>
-      <w:r>
-        <w:rPr>
-          <w:lang w:val="es-CO"/>
-        </w:rPr>
-        <w:t xml:space="preserve"> </w:t>
-      </w:r>
-      <w:proofErr w:type="spellStart"/>
-      <w:r>
-        <w:rPr>
-          <w:lang w:val="es-CO"/>
-        </w:rPr>
-        <w:t>Backward</w:t>
-      </w:r>
-      <w:proofErr w:type="spellEnd"/>
-      <w:r>
-        <w:rPr>
-          <w:lang w:val="es-CO"/>
-        </w:rPr>
-        <w:t xml:space="preserve">. En cambio, </w:t>
-      </w:r>
-      <w:proofErr w:type="spellStart"/>
-      <w:r>
-        <w:rPr>
-          <w:lang w:val="es-CO"/>
-        </w:rPr>
-        <w:t>idx_exposicion_bre</w:t>
-      </w:r>
-      <w:r>
-        <w:rPr>
-          <w:lang w:val="es-CO"/>
-        </w:rPr>
-        <w:t>cha_tipo_usuario</w:t>
-      </w:r>
-      <w:proofErr w:type="spellEnd"/>
-      <w:r>
-        <w:rPr>
-          <w:lang w:val="es-CO"/>
-        </w:rPr>
-        <w:t xml:space="preserve"> no aparece como acceso seleccionado por el optimizador.</w:t>
+        <w:t>El plan final confirma el uso de idx_brecha_fecha_severidad mediante Index Only Scan Backward. En cambio, idx_exposicion_brecha_tipo_usuario no aparece como acceso seleccionado por el optimizador.</w:t>
       </w:r>
     </w:p>
     <w:p>
@@ -2515,161 +1252,133 @@
           <w:rFonts w:ascii="Consolas" w:hAnsi="Consolas"/>
           <w:sz w:val="16"/>
         </w:rPr>
-        <w:t>Sort  (cost=1103.50..1107.37 rows=1550 width=60) (actual time=15.211..15.227 rows=109.00 loops=1)</w:t>
+        <w:t>Sort  (cost=1103.50..1107.37 rows=1550 width=60) (actual time=15.375..15.385 rows=109.00 loops=1)</w:t>
+        <w:br/>
+        <w:t xml:space="preserve">  Sort Key: (count(DISTINCT e.codigo_usuario)) DESC</w:t>
+        <w:br/>
+        <w:t xml:space="preserve">  InitPlan 2</w:t>
+        <w:br/>
+        <w:t xml:space="preserve">    -&gt; Index Only Scan Backward using idx_brecha_fecha_severidad on brecha</w:t>
+        <w:br/>
+        <w:t xml:space="preserve">  -&gt; GroupAggregate</w:t>
+        <w:br/>
+        <w:t xml:space="preserve">       -&gt; Incremental Sort</w:t>
+        <w:br/>
+        <w:t xml:space="preserve">            -&gt; Nested Loop</w:t>
+        <w:br/>
+        <w:t xml:space="preserve">                 -&gt; Merge Semi Join</w:t>
+        <w:br/>
+        <w:t xml:space="preserve">                      -&gt; Seq Scan on brecha b</w:t>
+        <w:br/>
+        <w:t xml:space="preserve">                      -&gt; Hash Join</w:t>
+        <w:br/>
+        <w:t xml:space="preserve">                           -&gt; Seq Scan on exposicion_usuario_brecha e_critica (rows=40000)</w:t>
+        <w:br/>
+        <w:t xml:space="preserve">                           -&gt; Seq Scan on tipo_dato_expuesto t_critico</w:t>
+        <w:br/>
+        <w:t xml:space="preserve">                 -&gt; Index Only Scan using pk_exposicion_usuario_brecha on exposicion_usuario_brecha e</w:t>
+        <w:br/>
+        <w:t>Planning Time: 1.055 ms</w:t>
+        <w:br/>
+        <w:t>Execution Time: 15.442 ms</w:t>
       </w:r>
-      <w:r>
-        <w:br/>
-      </w:r>
+      <w:r/>
       <w:r>
         <w:rPr>
           <w:rFonts w:ascii="Consolas" w:hAnsi="Consolas"/>
           <w:sz w:val="16"/>
         </w:rPr>
-        <w:t xml:space="preserve">  Sort Key: (count(DISTINCT e.codigo_usuario)) DESC</w:t>
       </w:r>
-      <w:r>
-        <w:br/>
-      </w:r>
+      <w:r/>
       <w:r>
         <w:rPr>
           <w:rFonts w:ascii="Consolas" w:hAnsi="Consolas"/>
           <w:sz w:val="16"/>
         </w:rPr>
-        <w:t xml:space="preserve">  InitPlan 2</w:t>
       </w:r>
-      <w:r>
-        <w:br/>
-      </w:r>
+      <w:r/>
       <w:r>
         <w:rPr>
           <w:rFonts w:ascii="Consolas" w:hAnsi="Consolas"/>
           <w:sz w:val="16"/>
         </w:rPr>
-        <w:t xml:space="preserve">    -&gt; Index Only Sc</w:t>
       </w:r>
+      <w:r/>
       <w:r>
         <w:rPr>
           <w:rFonts w:ascii="Consolas" w:hAnsi="Consolas"/>
           <w:sz w:val="16"/>
         </w:rPr>
-        <w:t>an Backward using idx_brecha_fecha_severidad on brecha</w:t>
       </w:r>
-      <w:r>
-        <w:br/>
-      </w:r>
+      <w:r/>
       <w:r>
         <w:rPr>
           <w:rFonts w:ascii="Consolas" w:hAnsi="Consolas"/>
           <w:sz w:val="16"/>
         </w:rPr>
-        <w:t xml:space="preserve">  -&gt; GroupAggregate</w:t>
       </w:r>
-      <w:r>
-        <w:br/>
-      </w:r>
+      <w:r/>
       <w:r>
         <w:rPr>
           <w:rFonts w:ascii="Consolas" w:hAnsi="Consolas"/>
           <w:sz w:val="16"/>
         </w:rPr>
-        <w:t xml:space="preserve">       -&gt; Incremental Sort</w:t>
       </w:r>
-      <w:r>
-        <w:br/>
-      </w:r>
+      <w:r/>
       <w:r>
         <w:rPr>
           <w:rFonts w:ascii="Consolas" w:hAnsi="Consolas"/>
           <w:sz w:val="16"/>
         </w:rPr>
-        <w:t xml:space="preserve">            -&gt; Nested Loop</w:t>
       </w:r>
-      <w:r>
-        <w:br/>
-      </w:r>
+      <w:r/>
       <w:r>
         <w:rPr>
           <w:rFonts w:ascii="Consolas" w:hAnsi="Consolas"/>
           <w:sz w:val="16"/>
         </w:rPr>
-        <w:t xml:space="preserve">                 -&gt; Merge Semi Join</w:t>
       </w:r>
-      <w:r>
-        <w:br/>
-      </w:r>
+      <w:r/>
       <w:r>
         <w:rPr>
           <w:rFonts w:ascii="Consolas" w:hAnsi="Consolas"/>
           <w:sz w:val="16"/>
         </w:rPr>
-        <w:t xml:space="preserve">                      -&gt; Seq Scan on brecha b</w:t>
       </w:r>
-      <w:r>
-        <w:br/>
-      </w:r>
+      <w:r/>
       <w:r>
         <w:rPr>
           <w:rFonts w:ascii="Consolas" w:hAnsi="Consolas"/>
           <w:sz w:val="16"/>
         </w:rPr>
-        <w:t xml:space="preserve">                      -&gt; Hash Join</w:t>
       </w:r>
-      <w:r>
-        <w:br/>
-      </w:r>
+      <w:r/>
       <w:r>
         <w:rPr>
           <w:rFonts w:ascii="Consolas" w:hAnsi="Consolas"/>
           <w:sz w:val="16"/>
         </w:rPr>
-        <w:t xml:space="preserve">          </w:t>
       </w:r>
+      <w:r/>
       <w:r>
         <w:rPr>
           <w:rFonts w:ascii="Consolas" w:hAnsi="Consolas"/>
           <w:sz w:val="16"/>
         </w:rPr>
-        <w:t xml:space="preserve">                 -&gt; Seq Scan on exposicion_usuario_brecha e_critica (rows=40000)</w:t>
       </w:r>
-      <w:r>
-        <w:br/>
-      </w:r>
+      <w:r/>
       <w:r>
         <w:rPr>
           <w:rFonts w:ascii="Consolas" w:hAnsi="Consolas"/>
           <w:sz w:val="16"/>
         </w:rPr>
-        <w:t xml:space="preserve">                           -&gt; Seq Scan on tipo_dato_expuesto t_critico</w:t>
       </w:r>
-      <w:r>
-        <w:br/>
-      </w:r>
+      <w:r/>
       <w:r>
         <w:rPr>
           <w:rFonts w:ascii="Consolas" w:hAnsi="Consolas"/>
           <w:sz w:val="16"/>
         </w:rPr>
-        <w:t xml:space="preserve">                 -&gt; Index Only Scan using pk_exposicion_usuario_brecha on exposicion_usuario_brecha e</w:t>
-      </w:r>
-      <w:r>
-        <w:br/>
-      </w:r>
-      <w:r>
-        <w:rPr>
-          <w:rFonts w:ascii="Consolas" w:hAnsi="Consolas"/>
-          <w:sz w:val="16"/>
-        </w:rPr>
-        <w:t>Planning Time: 0.651 ms</w:t>
-      </w:r>
-      <w:r>
-        <w:br/>
-      </w:r>
-      <w:r>
-        <w:rPr>
-          <w:rFonts w:ascii="Consolas" w:hAnsi="Consolas"/>
-          <w:sz w:val="16"/>
-        </w:rPr>
-        <w:t>Execution Time: 15.288 ms</w:t>
       </w:r>
     </w:p>
     <w:p>
@@ -2780,10 +1489,7 @@
           </w:tcPr>
           <w:p>
             <w:r>
-              <w:rPr>
-                <w:sz w:val="19"/>
-              </w:rPr>
-              <w:t>4.112 ms</w:t>
+              <w:t>1.106 ms</w:t>
             </w:r>
           </w:p>
         </w:tc>
@@ -2794,10 +1500,7 @@
           </w:tcPr>
           <w:p>
             <w:r>
-              <w:rPr>
-                <w:sz w:val="19"/>
-              </w:rPr>
-              <w:t>17.767 ms</w:t>
+              <w:t>15.543 ms</w:t>
             </w:r>
           </w:p>
         </w:tc>
@@ -2841,10 +1544,7 @@
           </w:tcPr>
           <w:p>
             <w:r>
-              <w:rPr>
-                <w:sz w:val="19"/>
-              </w:rPr>
-              <w:t>0.802 ms</w:t>
+              <w:t>0.860 ms</w:t>
             </w:r>
           </w:p>
         </w:tc>
@@ -2855,10 +1555,7 @@
           </w:tcPr>
           <w:p>
             <w:r>
-              <w:rPr>
-                <w:sz w:val="19"/>
-              </w:rPr>
-              <w:t>15.530 ms</w:t>
+              <w:t>14.795 ms</w:t>
             </w:r>
           </w:p>
         </w:tc>
@@ -2869,10 +1566,7 @@
           </w:tcPr>
           <w:p>
             <w:r>
-              <w:rPr>
-                <w:sz w:val="19"/>
-              </w:rPr>
-              <w:t>12.6% menor</w:t>
+              <w:t>4.8% menor</w:t>
             </w:r>
           </w:p>
         </w:tc>
@@ -2902,10 +1596,7 @@
           </w:tcPr>
           <w:p>
             <w:r>
-              <w:rPr>
-                <w:sz w:val="19"/>
-              </w:rPr>
-              <w:t>0.651 ms</w:t>
+              <w:t>1.055 ms</w:t>
             </w:r>
           </w:p>
         </w:tc>
@@ -2916,10 +1607,7 @@
           </w:tcPr>
           <w:p>
             <w:r>
-              <w:rPr>
-                <w:sz w:val="19"/>
-              </w:rPr>
-              <w:t>15.288 ms</w:t>
+              <w:t>15.442 ms</w:t>
             </w:r>
           </w:p>
         </w:tc>
@@ -2930,10 +1618,7 @@
           </w:tcPr>
           <w:p>
             <w:r>
-              <w:rPr>
-                <w:sz w:val="19"/>
-              </w:rPr>
-              <w:t>14.0% menor</w:t>
+              <w:t>0.6% menor</w:t>
             </w:r>
           </w:p>
         </w:tc>
@@ -2973,27 +1658,7 @@
         <w:rPr>
           <w:lang w:val="es-CO"/>
         </w:rPr>
-        <w:t xml:space="preserve">El índice </w:t>
-      </w:r>
-      <w:proofErr w:type="spellStart"/>
-      <w:r>
-        <w:rPr>
-          <w:lang w:val="es-CO"/>
-        </w:rPr>
-        <w:t>idx_brecha_fecha_seve</w:t>
-      </w:r>
-      <w:r>
-        <w:rPr>
-          <w:lang w:val="es-CO"/>
-        </w:rPr>
-        <w:t>ridad</w:t>
-      </w:r>
-      <w:proofErr w:type="spellEnd"/>
-      <w:r>
-        <w:rPr>
-          <w:lang w:val="es-CO"/>
-        </w:rPr>
-        <w:t xml:space="preserve"> sí fue utilizado y aportó la mejora principal. El segundo índice no fue seleccionado por el optimizador, por lo que su beneficio observado es marginal y no puede atribuirse directamente al plan.</w:t>
+        <w:t>El índice idx_brecha_fecha_severidad sí fue utilizado y aportó la mejora principal. El segundo índice no fue seleccionado por el optimizador, por lo que su beneficio observado es marginal y no puede atribuirse directamente al plan.</w:t>
       </w:r>
     </w:p>
     <w:sectPr>
@@ -3494,11 +2159,6 @@
     <w:lsdException w:name="Book Title" w:uiPriority="33" w:qFormat="1"/>
     <w:lsdException w:name="Bibliography" w:semiHidden="1" w:uiPriority="37" w:unhideWhenUsed="1"/>
     <w:lsdException w:name="TOC Heading" w:semiHidden="1" w:uiPriority="39" w:unhideWhenUsed="1" w:qFormat="1"/>
-    <w:lsdException w:name="Plain Table 5" w:semiHidden="1" w:unhideWhenUsed="1"/>
-    <w:lsdException w:name="Grid Table Light" w:semiHidden="1" w:unhideWhenUsed="1"/>
-    <w:lsdException w:name="Grid Table 1 Light" w:semiHidden="1" w:unhideWhenUsed="1"/>
-    <w:lsdException w:name="Grid Table 2" w:semiHidden="1" w:unhideWhenUsed="1"/>
-    <w:lsdException w:name="Grid Table 3" w:semiHidden="1" w:unhideWhenUsed="1"/>
     <w:lsdException w:name="Grid Table 4" w:uiPriority="49"/>
     <w:lsdException w:name="Grid Table 5 Dark" w:uiPriority="50"/>
     <w:lsdException w:name="Grid Table 6 Colorful" w:uiPriority="51"/>

</xml_diff>